<commit_message>
feat(roadmap): update full operational roadmap from Year 3 Sem 1 to Cambodia deployment
</commit_message>
<xml_diff>
--- a/docs/career-roadmap/LO_TRINH_SE_ERP_AI_VIBE_CODING.docx
+++ b/docs/career-roadmap/LO_TRINH_SE_ERP_AI_VIBE_CODING.docx
@@ -4,7 +4,7 @@
   <w:body>
     <w:p>
       <w:pPr>
-        <w:spacing w:before="200" w:after="80"/>
+        <w:spacing w:before="40" w:after="40"/>
         <w:jc w:val="center"/>
       </w:pPr>
       <w:r>
@@ -12,28 +12,41 @@
           <w:rFonts w:ascii="Arial" w:hAnsi="Arial"/>
           <w:b/>
           <w:color w:val="0E2B52"/>
-          <w:sz w:val="36"/>
+          <w:sz w:val="22"/>
         </w:rPr>
-        <w:t>LỘ TRÌNH CĂN TÍNH:</w:t>
+        <w:t>HỌC VIỆN CÔNG NGHỆ BƯU CHÍNH VIỄN THÔNG (PTIT) — CHƯƠNG TRÌNH CLC</w:t>
         <w:br/>
-        <w:t>KỸ THUẬT PHẦN MỀM &amp; KIẾN TRÚC ERP (SAP &amp; ODOO)</w:t>
-        <w:br/>
-        <w:t>TRONG KỶ NGUYÊN AI VIBE CODING</w:t>
+        <w:t>BẢN KẾ HOẠCH PHÁT TRIỂN NĂNG LỰC &amp; SỰ NGHIỆP CHIẾN LƯỢC</w:t>
       </w:r>
     </w:p>
     <w:p>
       <w:pPr>
-        <w:spacing w:before="40" w:after="280"/>
+        <w:spacing w:before="80" w:after="40"/>
+        <w:jc w:val="center"/>
+      </w:pPr>
+      <w:r>
+        <w:rPr>
+          <w:rFonts w:ascii="Arial" w:hAnsi="Arial"/>
+          <w:b/>
+          <w:color w:val="B41414"/>
+          <w:sz w:val="25"/>
+        </w:rPr>
+        <w:t>TỪ KỸ SƯ PHẦN MỀM BẢO MẬT ĐẾN CHUYÊN GIA GIẢI PHÁP ERP QUỐC TẾ</w:t>
+      </w:r>
+    </w:p>
+    <w:p>
+      <w:pPr>
+        <w:spacing w:before="40" w:after="120"/>
         <w:jc w:val="center"/>
       </w:pPr>
       <w:r>
         <w:rPr>
           <w:rFonts w:ascii="Arial" w:hAnsi="Arial"/>
           <w:i/>
-          <w:color w:val="505F6E"/>
-          <w:sz w:val="22"/>
+          <w:color w:val="465564"/>
+          <w:sz w:val="17"/>
         </w:rPr>
-        <w:t>Bản Thiết Kế Toàn Diện Từ Năm 3 Đại Học Đến Vị Trí Enterprise Solutions Architect</w:t>
+        <w:t>Strategic Career Blueprint: PTIT High-Quality SE, Deep Security &amp; International ERP Solution Architect</w:t>
       </w:r>
     </w:p>
     <w:tbl>
@@ -49,13 +62,13 @@
       <w:tr>
         <w:tc>
           <w:tcPr>
-            <w:tcW w:type="dxa" w:w="9936"/>
+            <w:tcW w:type="dxa" w:w="10080"/>
             <w:shd w:fill="F0F4F8"/>
             <w:tcMar>
-              <w:top w:w="140" w:type="dxa"/>
-              <w:bottom w:w="140" w:type="dxa"/>
-              <w:left w:w="200" w:type="dxa"/>
-              <w:right w:w="200" w:type="dxa"/>
+              <w:top w:w="100" w:type="dxa"/>
+              <w:bottom w:w="100" w:type="dxa"/>
+              <w:left w:w="150" w:type="dxa"/>
+              <w:right w:w="150" w:type="dxa"/>
             </w:tcMar>
             <w:tcBorders>
               <w:top w:val="none"/>
@@ -73,24 +86,22 @@
                 <w:rFonts w:ascii="Arial" w:hAnsi="Arial"/>
                 <w:b/>
                 <w:color w:val="1E3A5F"/>
-                <w:sz w:val="21"/>
+                <w:sz w:val="19"/>
               </w:rPr>
-              <w:t>📌 TRIẾT LÝ PHÁT TRIỂN NĂNG LỰC CỐT LÕI</w:t>
+              <w:t>📌 TỔNG QUAN CHIẾN LƯỢC: LẤY KỸ THUẬT LÀM LÕI, LẤY NGHIỆP VỤ LÀM VŨ KHÍ</w:t>
               <w:br/>
             </w:r>
             <w:r>
               <w:rPr>
                 <w:rFonts w:ascii="Arial" w:hAnsi="Arial"/>
                 <w:color w:val="28323C"/>
-                <w:sz w:val="20"/>
+                <w:sz w:val="17"/>
               </w:rPr>
-              <w:t>Lộ trình này được xây dựng trên 3 trục Căn Tính Cốt Lõi (First Principles):</w:t>
+              <w:t>• Định vị bản thân: Technical ERP Consultant / Solution Architect (Kiến trúc sư giải pháp &amp; can thiệp kernel lõi), tuyệt đối không dừng lại ở cấu hình bấm nút nghiệp vụ thông thường.</w:t>
               <w:br/>
-              <w:t>1. CĂN TÍNH KINH TẾ (ERP Domain): Hiểu thấu đáo cách tiền, tài sản, kho bãi và báo cáo tài chính vận hành trong thế giới thực.</w:t>
+              <w:t>• 3 Trụ cột di sản PTIT: standalone-policy-engine (&lt; 0.35ms Engine) + secure-multitenant-saas (PostgreSQL RLS &amp; WORM) + secure-fapi-zta-darkservices (FAPI 2.0 &amp; OpenZiti).</w:t>
               <w:br/>
-              <w:t>2. CĂN TÍNH HỆ THỐNG (SE Rigor): Kiến trúc vi dịch vụ phân tán, gRPC, OData, ACID, In-Memory Engine, Copy-On-Write lock-free.</w:t>
-              <w:br/>
-              <w:t>3. CĂN TÍNH THỜI ĐẠI (AI Agentic Orchestration): Bạn là Kiến trúc sư trưởng đưa ra đặc tả kỹ thuật; AI là trợ lý lập trình thực thi.</w:t>
+              <w:t>• Thị trường mục tiêu: Trung tâm tài chính Phnom Penh (Hệ thống thanh toán NBC Bakong / Banking ERP) → Global Enterprise.</w:t>
             </w:r>
           </w:p>
         </w:tc>
@@ -98,22 +109,381 @@
     </w:tbl>
     <w:p>
       <w:pPr>
-        <w:spacing w:before="0" w:after="80"/>
+        <w:spacing w:before="0" w:after="60"/>
       </w:pPr>
     </w:p>
     <w:p>
       <w:pPr>
         <w:keepNext/>
-        <w:spacing w:before="320" w:after="120"/>
+        <w:spacing w:before="240" w:after="60"/>
       </w:pPr>
       <w:r>
         <w:rPr>
           <w:rFonts w:ascii="Arial" w:hAnsi="Arial"/>
           <w:b/>
           <w:color w:val="0E2B52"/>
-          <w:sz w:val="30"/>
+          <w:sz w:val="24"/>
         </w:rPr>
-        <w:t>1. Tổng Quan 4 Giai Đoạn &amp; So Sánh Chiến Lược SAP vs Odoo</w:t>
+        <w:t>Giai Đoạn 1: Xây Móng Kỹ Thuật &amp; Khắc Phục Điểm Mù (Năm 3 Kỳ 1 - Hiện Tại)</w:t>
+      </w:r>
+    </w:p>
+    <w:p>
+      <w:pPr>
+        <w:pStyle w:val="ListBullet"/>
+        <w:spacing w:before="20" w:after="30" w:line="276" w:lineRule="auto"/>
+      </w:pPr>
+      <w:r>
+        <w:rPr>
+          <w:rFonts w:ascii="Arial" w:hAnsi="Arial"/>
+          <w:b/>
+          <w:color w:val="141E28"/>
+          <w:sz w:val="17"/>
+        </w:rPr>
+        <w:t xml:space="preserve">Môn bắt buộc tại PTIT CLC: </w:t>
+      </w:r>
+      <w:r>
+        <w:rPr>
+          <w:rFonts w:ascii="Arial" w:hAnsi="Arial"/>
+          <w:color w:val="323C46"/>
+          <w:sz w:val="17"/>
+        </w:rPr>
+        <w:t>Cơ sở dữ liệu (3NF, ACID Transactions), Hệ điều hành &amp; Mạng máy tính (Process/Thread, Virtual Memory, TCP/IP, REST), An toàn thông tin cơ sở.</w:t>
+      </w:r>
+    </w:p>
+    <w:p>
+      <w:pPr>
+        <w:pStyle w:val="ListBullet"/>
+        <w:spacing w:before="20" w:after="30" w:line="276" w:lineRule="auto"/>
+      </w:pPr>
+      <w:r>
+        <w:rPr>
+          <w:rFonts w:ascii="Arial" w:hAnsi="Arial"/>
+          <w:b/>
+          <w:color w:val="141E28"/>
+          <w:sz w:val="17"/>
+        </w:rPr>
+        <w:t xml:space="preserve">Thực hành Odoo Foundation: </w:t>
+      </w:r>
+      <w:r>
+        <w:rPr>
+          <w:rFonts w:ascii="Arial" w:hAnsi="Arial"/>
+          <w:color w:val="323C46"/>
+          <w:sz w:val="17"/>
+        </w:rPr>
+        <w:t>Cài đặt Odoo 17 trên Docker + PostgreSQL. Trải nghiệm nghiệp vụ 3 app cốt lõi (Sales, Inventory, Accounting) và cấu trúc module Odoo chuẩn.</w:t>
+      </w:r>
+    </w:p>
+    <w:p>
+      <w:pPr>
+        <w:pStyle w:val="ListBullet"/>
+        <w:spacing w:before="20" w:after="30" w:line="276" w:lineRule="auto"/>
+      </w:pPr>
+      <w:r>
+        <w:rPr>
+          <w:rFonts w:ascii="Arial" w:hAnsi="Arial"/>
+          <w:b/>
+          <w:color w:val="141E28"/>
+          <w:sz w:val="17"/>
+        </w:rPr>
+        <w:t xml:space="preserve">Triệt tiêu điểm mù: </w:t>
+      </w:r>
+      <w:r>
+        <w:rPr>
+          <w:rFonts w:ascii="Arial" w:hAnsi="Arial"/>
+          <w:color w:val="323C46"/>
+          <w:sz w:val="17"/>
+        </w:rPr>
+        <w:t>Soi trực tiếp các bảng PostgreSQL (sale_order, stock_picking, res_partner) qua DBeaver/pgAdmin khi AI sinh code. Chuyển toàn bộ tài liệu &amp; prompt sang tiếng Anh 100%.</w:t>
+      </w:r>
+    </w:p>
+    <w:p>
+      <w:pPr>
+        <w:keepNext/>
+        <w:spacing w:before="240" w:after="60"/>
+      </w:pPr>
+      <w:r>
+        <w:rPr>
+          <w:rFonts w:ascii="Arial" w:hAnsi="Arial"/>
+          <w:b/>
+          <w:color w:val="0E2B52"/>
+          <w:sz w:val="24"/>
+        </w:rPr>
+        <w:t>Giai Đoạn 2: Làm Chủ Odoo &amp; Tích Hợp Hệ Thống (Năm 3 Kỳ 2)</w:t>
+      </w:r>
+    </w:p>
+    <w:p>
+      <w:pPr>
+        <w:pStyle w:val="ListBullet"/>
+        <w:spacing w:before="20" w:after="30" w:line="276" w:lineRule="auto"/>
+      </w:pPr>
+      <w:r>
+        <w:rPr>
+          <w:rFonts w:ascii="Arial" w:hAnsi="Arial"/>
+          <w:b/>
+          <w:color w:val="141E28"/>
+          <w:sz w:val="17"/>
+        </w:rPr>
+        <w:t xml:space="preserve">Kiến thức kỹ thuật cốt lõi: </w:t>
+      </w:r>
+      <w:r>
+        <w:rPr>
+          <w:rFonts w:ascii="Arial" w:hAnsi="Arial"/>
+          <w:color w:val="323C46"/>
+          <w:sz w:val="17"/>
+        </w:rPr>
+        <w:t>Odoo ORM chuyên sâu (Python Decorators, create, write), Hệ thống phân quyền ir.model.access.csv và Record Rules (ir.rule) tương ứng với PostgreSQL RLS.</w:t>
+      </w:r>
+    </w:p>
+    <w:p>
+      <w:pPr>
+        <w:pStyle w:val="ListBullet"/>
+        <w:spacing w:before="20" w:after="30" w:line="276" w:lineRule="auto"/>
+      </w:pPr>
+      <w:r>
+        <w:rPr>
+          <w:rFonts w:ascii="Arial" w:hAnsi="Arial"/>
+          <w:b/>
+          <w:color w:val="141E28"/>
+          <w:sz w:val="17"/>
+        </w:rPr>
+        <w:t xml:space="preserve">Dự án then chốt: </w:t>
+      </w:r>
+      <w:r>
+        <w:rPr>
+          <w:rFonts w:ascii="Arial" w:hAnsi="Arial"/>
+          <w:color w:val="323C46"/>
+          <w:sz w:val="17"/>
+        </w:rPr>
+        <w:t>Tự xây dựng Custom Module 'custom_approval_and_branch_isolation' tích hợp với Standalone Go PDP Engine để đánh giá quyền hạn mức thời gian thực.</w:t>
+      </w:r>
+    </w:p>
+    <w:p>
+      <w:pPr>
+        <w:pStyle w:val="ListBullet"/>
+        <w:spacing w:before="20" w:after="30" w:line="276" w:lineRule="auto"/>
+      </w:pPr>
+      <w:r>
+        <w:rPr>
+          <w:rFonts w:ascii="Arial" w:hAnsi="Arial"/>
+          <w:b/>
+          <w:color w:val="141E28"/>
+          <w:sz w:val="17"/>
+        </w:rPr>
+        <w:t xml:space="preserve">Điểm mù cần tránh: </w:t>
+      </w:r>
+      <w:r>
+        <w:rPr>
+          <w:rFonts w:ascii="Arial" w:hAnsi="Arial"/>
+          <w:color w:val="323C46"/>
+          <w:sz w:val="17"/>
+        </w:rPr>
+        <w:t>Tuyệt đối không xóa đơn hàng đã xuất kho hoặc thanh toán trong DB. Luôn xử lý bằng cơ chế hủy chứng từ hoặc tạo bút toán đảo để bảo vệ kế toán kép.</w:t>
+      </w:r>
+    </w:p>
+    <w:p>
+      <w:pPr>
+        <w:keepNext/>
+        <w:spacing w:before="240" w:after="60"/>
+      </w:pPr>
+      <w:r>
+        <w:rPr>
+          <w:rFonts w:ascii="Arial" w:hAnsi="Arial"/>
+          <w:b/>
+          <w:color w:val="0E2B52"/>
+          <w:sz w:val="24"/>
+        </w:rPr>
+        <w:t>Giai Đoạn 3: Phân Chuyên Ngành SE, Nạp Tư Duy SAP &amp; Khóa Luận (Năm 4)</w:t>
+      </w:r>
+    </w:p>
+    <w:p>
+      <w:pPr>
+        <w:pStyle w:val="ListBullet"/>
+        <w:spacing w:before="20" w:after="30" w:line="276" w:lineRule="auto"/>
+      </w:pPr>
+      <w:r>
+        <w:rPr>
+          <w:rFonts w:ascii="Arial" w:hAnsi="Arial"/>
+          <w:b/>
+          <w:color w:val="141E28"/>
+          <w:sz w:val="17"/>
+        </w:rPr>
+        <w:t xml:space="preserve">Chuyên ngành tại PTIT: </w:t>
+      </w:r>
+      <w:r>
+        <w:rPr>
+          <w:rFonts w:ascii="Arial" w:hAnsi="Arial"/>
+          <w:color w:val="323C46"/>
+          <w:sz w:val="17"/>
+        </w:rPr>
+        <w:t>Kỹ thuật Phần mềm (SE) - Tập trung cao độ môn Kiến trúc &amp; Thiết kế phần mềm, Phát triển phần mềm an toàn và Hệ thống phân tán.</w:t>
+      </w:r>
+    </w:p>
+    <w:p>
+      <w:pPr>
+        <w:pStyle w:val="ListBullet"/>
+        <w:spacing w:before="20" w:after="30" w:line="276" w:lineRule="auto"/>
+      </w:pPr>
+      <w:r>
+        <w:rPr>
+          <w:rFonts w:ascii="Arial" w:hAnsi="Arial"/>
+          <w:b/>
+          <w:color w:val="141E28"/>
+          <w:sz w:val="17"/>
+        </w:rPr>
+        <w:t xml:space="preserve">Chuẩn tư duy SAP Enterprise: </w:t>
+      </w:r>
+      <w:r>
+        <w:rPr>
+          <w:rFonts w:ascii="Arial" w:hAnsi="Arial"/>
+          <w:color w:val="323C46"/>
+          <w:sz w:val="17"/>
+        </w:rPr>
+        <w:t>Học 3 phân hệ cốt lõi SAP MM (P2P), SAP SD (O2C), SAP FI (General Ledger, Dr/Cr). Nắm vững giao thức SAP OData (RESTful) và triết lý SAP Clean Core.</w:t>
+      </w:r>
+    </w:p>
+    <w:p>
+      <w:pPr>
+        <w:pStyle w:val="ListBullet"/>
+        <w:spacing w:before="20" w:after="30" w:line="276" w:lineRule="auto"/>
+      </w:pPr>
+      <w:r>
+        <w:rPr>
+          <w:rFonts w:ascii="Arial" w:hAnsi="Arial"/>
+          <w:b/>
+          <w:color w:val="141E28"/>
+          <w:sz w:val="17"/>
+        </w:rPr>
+        <w:t xml:space="preserve">Đồ án tốt nghiệp xuất sắc: </w:t>
+      </w:r>
+      <w:r>
+        <w:rPr>
+          <w:rFonts w:ascii="Arial" w:hAnsi="Arial"/>
+          <w:color w:val="323C46"/>
+          <w:sz w:val="17"/>
+        </w:rPr>
+        <w:t>Xây dựng cổng trung gian Middleware Zero Trust đồng bộ dữ liệu giữa Odoo 17 (Chi nhánh) và Mock SAP S/4HANA OData, phân quyền PDP 1M+ RPS.</w:t>
+      </w:r>
+    </w:p>
+    <w:p>
+      <w:pPr>
+        <w:pStyle w:val="ListBullet"/>
+        <w:spacing w:before="20" w:after="30" w:line="276" w:lineRule="auto"/>
+      </w:pPr>
+      <w:r>
+        <w:rPr>
+          <w:rFonts w:ascii="Arial" w:hAnsi="Arial"/>
+          <w:b/>
+          <w:color w:val="141E28"/>
+          <w:sz w:val="17"/>
+        </w:rPr>
+        <w:t xml:space="preserve">Điểm mù cần tránh: </w:t>
+      </w:r>
+      <w:r>
+        <w:rPr>
+          <w:rFonts w:ascii="Arial" w:hAnsi="Arial"/>
+          <w:color w:val="323C46"/>
+          <w:sz w:val="17"/>
+        </w:rPr>
+        <w:t>Không học vẹt mã T-Code SAP. Tập trung hiểu bản chất luồng dữ liệu và máy trạng thái (State Machine) trong Database.</w:t>
+      </w:r>
+    </w:p>
+    <w:p>
+      <w:pPr>
+        <w:keepNext/>
+        <w:spacing w:before="240" w:after="60"/>
+      </w:pPr>
+      <w:r>
+        <w:rPr>
+          <w:rFonts w:ascii="Arial" w:hAnsi="Arial"/>
+          <w:b/>
+          <w:color w:val="0E2B52"/>
+          <w:sz w:val="24"/>
+        </w:rPr>
+        <w:t>Giai Đoạn 4: Thực Tập Cùng Mentor &amp; Chuẩn Bị Xuất Ngoại (Học Kỳ Cuối &amp; Ra Trường)</w:t>
+      </w:r>
+    </w:p>
+    <w:p>
+      <w:pPr>
+        <w:pStyle w:val="ListBullet"/>
+        <w:spacing w:before="20" w:after="30" w:line="276" w:lineRule="auto"/>
+      </w:pPr>
+      <w:r>
+        <w:rPr>
+          <w:rFonts w:ascii="Arial" w:hAnsi="Arial"/>
+          <w:b/>
+          <w:color w:val="141E28"/>
+          <w:sz w:val="17"/>
+        </w:rPr>
+        <w:t xml:space="preserve">Làm việc với Mentor: </w:t>
+      </w:r>
+      <w:r>
+        <w:rPr>
+          <w:rFonts w:ascii="Arial" w:hAnsi="Arial"/>
+          <w:color w:val="323C46"/>
+          <w:sz w:val="17"/>
+        </w:rPr>
+        <w:t>Chủ động khai thác bài toán công nghệ tại Campuchia (Ngân hàng, Bán lẻ, Odoo/SAP), tiếp cận tài liệu BRD và thiết kế kỹ thuật thực tế.</w:t>
+      </w:r>
+    </w:p>
+    <w:p>
+      <w:pPr>
+        <w:pStyle w:val="ListBullet"/>
+        <w:spacing w:before="20" w:after="30" w:line="276" w:lineRule="auto"/>
+      </w:pPr>
+      <w:r>
+        <w:rPr>
+          <w:rFonts w:ascii="Arial" w:hAnsi="Arial"/>
+          <w:b/>
+          <w:color w:val="141E28"/>
+          <w:sz w:val="17"/>
+        </w:rPr>
+        <w:t xml:space="preserve">Hành trang thị trường Phnom Penh: </w:t>
+      </w:r>
+      <w:r>
+        <w:rPr>
+          <w:rFonts w:ascii="Arial" w:hAnsi="Arial"/>
+          <w:color w:val="323C46"/>
+          <w:sz w:val="17"/>
+        </w:rPr>
+        <w:t>Năng lực làm việc và debug độc lập, kỹ năng giao tiếp tiếng Anh thương mại, tích hợp API thanh toán quốc gia Bakong (NBC) qua chuẩn FAPI 2.0.</w:t>
+      </w:r>
+    </w:p>
+    <w:p>
+      <w:pPr>
+        <w:pStyle w:val="ListBullet"/>
+        <w:spacing w:before="20" w:after="30" w:line="276" w:lineRule="auto"/>
+      </w:pPr>
+      <w:r>
+        <w:rPr>
+          <w:rFonts w:ascii="Arial" w:hAnsi="Arial"/>
+          <w:b/>
+          <w:color w:val="141E28"/>
+          <w:sz w:val="17"/>
+        </w:rPr>
+        <w:t xml:space="preserve">Hồ sơ năng lực (Portfolio): </w:t>
+      </w:r>
+      <w:r>
+        <w:rPr>
+          <w:rFonts w:ascii="Arial" w:hAnsi="Arial"/>
+          <w:color w:val="323C46"/>
+          <w:sz w:val="17"/>
+        </w:rPr>
+        <w:t>CV định vị Kỹ sư SE Chất lượng cao từ PTIT, am hiểu sâu kiến trúc Odoo/PostgreSQL, chuẩn tích hợp SAP và hạ tầng bảo mật Zero Trust.</w:t>
+      </w:r>
+    </w:p>
+    <w:p>
+      <w:pPr>
+        <w:keepNext/>
+        <w:spacing w:before="240" w:after="60"/>
+      </w:pPr>
+      <w:r>
+        <w:rPr>
+          <w:rFonts w:ascii="Arial" w:hAnsi="Arial"/>
+          <w:b/>
+          <w:color w:val="0E2B52"/>
+          <w:sz w:val="24"/>
+        </w:rPr>
+        <w:t>Bảng Đối Chiếu Kiến Thức Bắt Buộc &amp; Kế Thừa Nền Tảng</w:t>
       </w:r>
     </w:p>
     <w:tbl>
@@ -124,86 +494,101 @@
         <w:tblLook w:firstColumn="1" w:firstRow="1" w:lastColumn="0" w:lastRow="0" w:noHBand="0" w:noVBand="1" w:val="04A0"/>
       </w:tblPr>
       <w:tblGrid>
-        <w:gridCol w:w="3312"/>
-        <w:gridCol w:w="3312"/>
-        <w:gridCol w:w="3312"/>
+        <w:gridCol w:w="2520"/>
+        <w:gridCol w:w="2520"/>
+        <w:gridCol w:w="2520"/>
+        <w:gridCol w:w="2520"/>
       </w:tblGrid>
       <w:tr>
+        <w:tc>
+          <w:tcPr>
+            <w:tcW w:type="dxa" w:w="1872"/>
+            <w:shd w:fill="1E3A5F"/>
+            <w:tcMar>
+              <w:top w:w="35" w:type="dxa"/>
+              <w:bottom w:w="35" w:type="dxa"/>
+              <w:left w:w="50" w:type="dxa"/>
+              <w:right w:w="50" w:type="dxa"/>
+            </w:tcMar>
+          </w:tcPr>
+          <w:p>
+            <w:r>
+              <w:rPr>
+                <w:rFonts w:ascii="Arial" w:hAnsi="Arial"/>
+                <w:b/>
+                <w:color w:val="FFFFFF"/>
+                <w:sz w:val="16"/>
+              </w:rPr>
+              <w:t>Trụ Cột</w:t>
+            </w:r>
+          </w:p>
+        </w:tc>
         <w:tc>
           <w:tcPr>
             <w:tcW w:type="dxa" w:w="2592"/>
             <w:shd w:fill="1E3A5F"/>
             <w:tcMar>
-              <w:top w:w="80" w:type="dxa"/>
-              <w:bottom w:w="80" w:type="dxa"/>
-              <w:left w:w="100" w:type="dxa"/>
-              <w:right w:w="100" w:type="dxa"/>
+              <w:top w:w="35" w:type="dxa"/>
+              <w:bottom w:w="35" w:type="dxa"/>
+              <w:left w:w="50" w:type="dxa"/>
+              <w:right w:w="50" w:type="dxa"/>
             </w:tcMar>
           </w:tcPr>
           <w:p>
-            <w:pPr>
-              <w:jc w:val="left"/>
-            </w:pPr>
             <w:r>
               <w:rPr>
                 <w:rFonts w:ascii="Arial" w:hAnsi="Arial"/>
                 <w:b/>
                 <w:color w:val="FFFFFF"/>
-                <w:sz w:val="19"/>
+                <w:sz w:val="16"/>
               </w:rPr>
-              <w:t>Tiêu Chí Đánh Giá</w:t>
+              <w:t>Nền Tảng Đã Có (PTIT)</w:t>
             </w:r>
           </w:p>
         </w:tc>
         <w:tc>
           <w:tcPr>
-            <w:tcW w:type="dxa" w:w="3456"/>
+            <w:tcW w:type="dxa" w:w="2592"/>
             <w:shd w:fill="1E3A5F"/>
             <w:tcMar>
-              <w:top w:w="80" w:type="dxa"/>
-              <w:bottom w:w="80" w:type="dxa"/>
-              <w:left w:w="100" w:type="dxa"/>
-              <w:right w:w="100" w:type="dxa"/>
+              <w:top w:w="35" w:type="dxa"/>
+              <w:bottom w:w="35" w:type="dxa"/>
+              <w:left w:w="50" w:type="dxa"/>
+              <w:right w:w="50" w:type="dxa"/>
             </w:tcMar>
           </w:tcPr>
           <w:p>
-            <w:pPr>
-              <w:jc w:val="left"/>
-            </w:pPr>
             <w:r>
               <w:rPr>
                 <w:rFonts w:ascii="Arial" w:hAnsi="Arial"/>
                 <w:b/>
                 <w:color w:val="FFFFFF"/>
-                <w:sz w:val="19"/>
+                <w:sz w:val="16"/>
               </w:rPr>
-              <w:t>Hệ Sinh Thái Odoo ERP</w:t>
+              <w:t>Kiến Thức ERP Bắt Buộc</w:t>
             </w:r>
           </w:p>
         </w:tc>
         <w:tc>
           <w:tcPr>
-            <w:tcW w:type="dxa" w:w="3456"/>
+            <w:tcW w:type="dxa" w:w="2304"/>
             <w:shd w:fill="1E3A5F"/>
             <w:tcMar>
-              <w:top w:w="80" w:type="dxa"/>
-              <w:bottom w:w="80" w:type="dxa"/>
-              <w:left w:w="100" w:type="dxa"/>
-              <w:right w:w="100" w:type="dxa"/>
+              <w:top w:w="35" w:type="dxa"/>
+              <w:bottom w:w="35" w:type="dxa"/>
+              <w:left w:w="50" w:type="dxa"/>
+              <w:right w:w="50" w:type="dxa"/>
             </w:tcMar>
           </w:tcPr>
           <w:p>
-            <w:pPr>
-              <w:jc w:val="left"/>
-            </w:pPr>
             <w:r>
               <w:rPr>
                 <w:rFonts w:ascii="Arial" w:hAnsi="Arial"/>
                 <w:b/>
                 <w:color w:val="FFFFFF"/>
-                <w:sz w:val="19"/>
+                <w:sz w:val="16"/>
               </w:rPr>
-              <w:t>Hệ Sinh Thái SAP (S/4HANA / BTP)</w:t>
+              <w:t>Điểm Mù Thường Gặp</w:t>
             </w:r>
           </w:p>
         </w:tc>
@@ -211,13 +596,13 @@
       <w:tr>
         <w:tc>
           <w:tcPr>
-            <w:tcW w:type="dxa" w:w="2592"/>
+            <w:tcW w:type="dxa" w:w="1872"/>
             <w:shd w:fill="F7FAFC"/>
             <w:tcMar>
-              <w:top w:w="60" w:type="dxa"/>
-              <w:bottom w:w="60" w:type="dxa"/>
-              <w:left w:w="100" w:type="dxa"/>
-              <w:right w:w="100" w:type="dxa"/>
+              <w:top w:w="30" w:type="dxa"/>
+              <w:bottom w:w="30" w:type="dxa"/>
+              <w:left w:w="45" w:type="dxa"/>
+              <w:right w:w="45" w:type="dxa"/>
             </w:tcMar>
           </w:tcPr>
           <w:p>
@@ -226,21 +611,21 @@
                 <w:rFonts w:ascii="Arial" w:hAnsi="Arial"/>
                 <w:b/>
                 <w:color w:val="1E2832"/>
-                <w:sz w:val="18"/>
+                <w:sz w:val="15"/>
               </w:rPr>
-              <w:t>Phân khúc thị trường</w:t>
+              <w:t>Lập Trình &amp; Ngôn Ngữ</w:t>
             </w:r>
           </w:p>
         </w:tc>
         <w:tc>
           <w:tcPr>
-            <w:tcW w:type="dxa" w:w="3456"/>
+            <w:tcW w:type="dxa" w:w="2592"/>
             <w:shd w:fill="F7FAFC"/>
             <w:tcMar>
-              <w:top w:w="60" w:type="dxa"/>
-              <w:bottom w:w="60" w:type="dxa"/>
-              <w:left w:w="100" w:type="dxa"/>
-              <w:right w:w="100" w:type="dxa"/>
+              <w:top w:w="30" w:type="dxa"/>
+              <w:bottom w:w="30" w:type="dxa"/>
+              <w:left w:w="45" w:type="dxa"/>
+              <w:right w:w="45" w:type="dxa"/>
             </w:tcMar>
           </w:tcPr>
           <w:p>
@@ -248,21 +633,21 @@
               <w:rPr>
                 <w:rFonts w:ascii="Arial" w:hAnsi="Arial"/>
                 <w:color w:val="1E2832"/>
-                <w:sz w:val="18"/>
+                <w:sz w:val="15"/>
               </w:rPr>
-              <w:t>Doanh nghiệp vừa &amp; nhỏ (SME), Tech startup</w:t>
+              <w:t>Go, TypeScript, C++, Python cơ bản</w:t>
             </w:r>
           </w:p>
         </w:tc>
         <w:tc>
           <w:tcPr>
-            <w:tcW w:type="dxa" w:w="3456"/>
+            <w:tcW w:type="dxa" w:w="2592"/>
             <w:shd w:fill="F7FAFC"/>
             <w:tcMar>
-              <w:top w:w="60" w:type="dxa"/>
-              <w:bottom w:w="60" w:type="dxa"/>
-              <w:left w:w="100" w:type="dxa"/>
-              <w:right w:w="100" w:type="dxa"/>
+              <w:top w:w="30" w:type="dxa"/>
+              <w:bottom w:w="30" w:type="dxa"/>
+              <w:left w:w="45" w:type="dxa"/>
+              <w:right w:w="45" w:type="dxa"/>
             </w:tcMar>
           </w:tcPr>
           <w:p>
@@ -270,9 +655,31 @@
               <w:rPr>
                 <w:rFonts w:ascii="Arial" w:hAnsi="Arial"/>
                 <w:color w:val="1E2832"/>
-                <w:sz w:val="18"/>
+                <w:sz w:val="15"/>
               </w:rPr>
-              <w:t>Tập đoàn tỷ USD, Đa quốc gia (Vinamilk, Big 4)</w:t>
+              <w:t>Python chuyên sâu Odoo ORM, Decorators, Inheritance</w:t>
+            </w:r>
+          </w:p>
+        </w:tc>
+        <w:tc>
+          <w:tcPr>
+            <w:tcW w:type="dxa" w:w="2304"/>
+            <w:shd w:fill="F7FAFC"/>
+            <w:tcMar>
+              <w:top w:w="30" w:type="dxa"/>
+              <w:bottom w:w="30" w:type="dxa"/>
+              <w:left w:w="45" w:type="dxa"/>
+              <w:right w:w="45" w:type="dxa"/>
+            </w:tcMar>
+          </w:tcPr>
+          <w:p>
+            <w:r>
+              <w:rPr>
+                <w:rFonts w:ascii="Arial" w:hAnsi="Arial"/>
+                <w:color w:val="1E2832"/>
+                <w:sz w:val="15"/>
+              </w:rPr>
+              <w:t>Chỉ biết prompt AI mà không tự trace stack trace khi lỗi.</w:t>
             </w:r>
           </w:p>
         </w:tc>
@@ -280,13 +687,13 @@
       <w:tr>
         <w:tc>
           <w:tcPr>
-            <w:tcW w:type="dxa" w:w="2592"/>
+            <w:tcW w:type="dxa" w:w="1872"/>
             <w:shd w:fill="FFFFFF"/>
             <w:tcMar>
-              <w:top w:w="60" w:type="dxa"/>
-              <w:bottom w:w="60" w:type="dxa"/>
-              <w:left w:w="100" w:type="dxa"/>
-              <w:right w:w="100" w:type="dxa"/>
+              <w:top w:w="30" w:type="dxa"/>
+              <w:bottom w:w="30" w:type="dxa"/>
+              <w:left w:w="45" w:type="dxa"/>
+              <w:right w:w="45" w:type="dxa"/>
             </w:tcMar>
           </w:tcPr>
           <w:p>
@@ -295,21 +702,21 @@
                 <w:rFonts w:ascii="Arial" w:hAnsi="Arial"/>
                 <w:b/>
                 <w:color w:val="1E2832"/>
-                <w:sz w:val="18"/>
+                <w:sz w:val="15"/>
               </w:rPr>
-              <w:t>Công nghệ &amp; Mã nguồn</w:t>
+              <w:t>Cơ Sở Dữ Liệu</w:t>
             </w:r>
           </w:p>
         </w:tc>
         <w:tc>
           <w:tcPr>
-            <w:tcW w:type="dxa" w:w="3456"/>
+            <w:tcW w:type="dxa" w:w="2592"/>
             <w:shd w:fill="FFFFFF"/>
             <w:tcMar>
-              <w:top w:w="60" w:type="dxa"/>
-              <w:bottom w:w="60" w:type="dxa"/>
-              <w:left w:w="100" w:type="dxa"/>
-              <w:right w:w="100" w:type="dxa"/>
+              <w:top w:w="30" w:type="dxa"/>
+              <w:bottom w:w="30" w:type="dxa"/>
+              <w:left w:w="45" w:type="dxa"/>
+              <w:right w:w="45" w:type="dxa"/>
             </w:tcMar>
           </w:tcPr>
           <w:p>
@@ -317,21 +724,21 @@
               <w:rPr>
                 <w:rFonts w:ascii="Arial" w:hAnsi="Arial"/>
                 <w:color w:val="1E2832"/>
-                <w:sz w:val="18"/>
+                <w:sz w:val="15"/>
               </w:rPr>
-              <w:t>100% Open-Source (Python, PostgreSQL, OWL)</w:t>
+              <w:t>PostgreSQL RLS, B-Tree, NoSQL</w:t>
             </w:r>
           </w:p>
         </w:tc>
         <w:tc>
           <w:tcPr>
-            <w:tcW w:type="dxa" w:w="3456"/>
+            <w:tcW w:type="dxa" w:w="2592"/>
             <w:shd w:fill="FFFFFF"/>
             <w:tcMar>
-              <w:top w:w="60" w:type="dxa"/>
-              <w:bottom w:w="60" w:type="dxa"/>
-              <w:left w:w="100" w:type="dxa"/>
-              <w:right w:w="100" w:type="dxa"/>
+              <w:top w:w="30" w:type="dxa"/>
+              <w:bottom w:w="30" w:type="dxa"/>
+              <w:left w:w="45" w:type="dxa"/>
+              <w:right w:w="45" w:type="dxa"/>
             </w:tcMar>
           </w:tcPr>
           <w:p>
@@ -339,9 +746,31 @@
               <w:rPr>
                 <w:rFonts w:ascii="Arial" w:hAnsi="Arial"/>
                 <w:color w:val="1E2832"/>
-                <w:sz w:val="18"/>
+                <w:sz w:val="15"/>
               </w:rPr>
-              <w:t>Enterprise Cloud (ABAP on Cloud, SAP BTP, OData)</w:t>
+              <w:t>PostgreSQL Transaction, Locks, Query Optimization, Foreign Keys</w:t>
+            </w:r>
+          </w:p>
+        </w:tc>
+        <w:tc>
+          <w:tcPr>
+            <w:tcW w:type="dxa" w:w="2304"/>
+            <w:shd w:fill="FFFFFF"/>
+            <w:tcMar>
+              <w:top w:w="30" w:type="dxa"/>
+              <w:bottom w:w="30" w:type="dxa"/>
+              <w:left w:w="45" w:type="dxa"/>
+              <w:right w:w="45" w:type="dxa"/>
+            </w:tcMar>
+          </w:tcPr>
+          <w:p>
+            <w:r>
+              <w:rPr>
+                <w:rFonts w:ascii="Arial" w:hAnsi="Arial"/>
+                <w:color w:val="1E2832"/>
+                <w:sz w:val="15"/>
+              </w:rPr>
+              <w:t>Không kiểm soát được deadlock hoặc làm sai lệch tồn kho.</w:t>
             </w:r>
           </w:p>
         </w:tc>
@@ -349,13 +778,13 @@
       <w:tr>
         <w:tc>
           <w:tcPr>
-            <w:tcW w:type="dxa" w:w="2592"/>
+            <w:tcW w:type="dxa" w:w="1872"/>
             <w:shd w:fill="F7FAFC"/>
             <w:tcMar>
-              <w:top w:w="60" w:type="dxa"/>
-              <w:bottom w:w="60" w:type="dxa"/>
-              <w:left w:w="100" w:type="dxa"/>
-              <w:right w:w="100" w:type="dxa"/>
+              <w:top w:w="30" w:type="dxa"/>
+              <w:bottom w:w="30" w:type="dxa"/>
+              <w:left w:w="45" w:type="dxa"/>
+              <w:right w:w="45" w:type="dxa"/>
             </w:tcMar>
           </w:tcPr>
           <w:p>
@@ -364,21 +793,21 @@
                 <w:rFonts w:ascii="Arial" w:hAnsi="Arial"/>
                 <w:b/>
                 <w:color w:val="1E2832"/>
-                <w:sz w:val="18"/>
+                <w:sz w:val="15"/>
               </w:rPr>
-              <w:t>Mục tiêu học tập</w:t>
+              <w:t>Bảo Mật &amp; Phân Quyền</w:t>
             </w:r>
           </w:p>
         </w:tc>
         <w:tc>
           <w:tcPr>
-            <w:tcW w:type="dxa" w:w="3456"/>
+            <w:tcW w:type="dxa" w:w="2592"/>
             <w:shd w:fill="F7FAFC"/>
             <w:tcMar>
-              <w:top w:w="60" w:type="dxa"/>
-              <w:bottom w:w="60" w:type="dxa"/>
-              <w:left w:w="100" w:type="dxa"/>
-              <w:right w:w="100" w:type="dxa"/>
+              <w:top w:w="30" w:type="dxa"/>
+              <w:bottom w:w="30" w:type="dxa"/>
+              <w:left w:w="45" w:type="dxa"/>
+              <w:right w:w="45" w:type="dxa"/>
             </w:tcMar>
           </w:tcPr>
           <w:p>
@@ -386,21 +815,21 @@
               <w:rPr>
                 <w:rFonts w:ascii="Arial" w:hAnsi="Arial"/>
                 <w:color w:val="1E2832"/>
-                <w:sz w:val="18"/>
+                <w:sz w:val="15"/>
               </w:rPr>
-              <w:t>Khai phá ruột gan code, hiểu cấu trúc dữ liệu</w:t>
+              <w:t>Zero Trust, mTLS, DPoP, PBAC/ABAC</w:t>
             </w:r>
           </w:p>
         </w:tc>
         <w:tc>
           <w:tcPr>
-            <w:tcW w:type="dxa" w:w="3456"/>
+            <w:tcW w:type="dxa" w:w="2592"/>
             <w:shd w:fill="F7FAFC"/>
             <w:tcMar>
-              <w:top w:w="60" w:type="dxa"/>
-              <w:bottom w:w="60" w:type="dxa"/>
-              <w:left w:w="100" w:type="dxa"/>
-              <w:right w:w="100" w:type="dxa"/>
+              <w:top w:w="30" w:type="dxa"/>
+              <w:bottom w:w="30" w:type="dxa"/>
+              <w:left w:w="45" w:type="dxa"/>
+              <w:right w:w="45" w:type="dxa"/>
             </w:tcMar>
           </w:tcPr>
           <w:p>
@@ -408,9 +837,31 @@
               <w:rPr>
                 <w:rFonts w:ascii="Arial" w:hAnsi="Arial"/>
                 <w:color w:val="1E2832"/>
-                <w:sz w:val="18"/>
+                <w:sz w:val="15"/>
               </w:rPr>
-              <w:t>Học chuẩn quy trình doanh nghiệp toàn cầu</w:t>
+              <w:t>Odoo ACL, Record Rules, SAP GRC Access Control (SoD)</w:t>
+            </w:r>
+          </w:p>
+        </w:tc>
+        <w:tc>
+          <w:tcPr>
+            <w:tcW w:type="dxa" w:w="2304"/>
+            <w:shd w:fill="F7FAFC"/>
+            <w:tcMar>
+              <w:top w:w="30" w:type="dxa"/>
+              <w:bottom w:w="30" w:type="dxa"/>
+              <w:left w:w="45" w:type="dxa"/>
+              <w:right w:w="45" w:type="dxa"/>
+            </w:tcMar>
+          </w:tcPr>
+          <w:p>
+            <w:r>
+              <w:rPr>
+                <w:rFonts w:ascii="Arial" w:hAnsi="Arial"/>
+                <w:color w:val="1E2832"/>
+                <w:sz w:val="15"/>
+              </w:rPr>
+              <w:t>Nhầm lẫn giữa quyền UI và quyền dữ liệu tầng CSDL.</w:t>
             </w:r>
           </w:p>
         </w:tc>
@@ -418,13 +869,13 @@
       <w:tr>
         <w:tc>
           <w:tcPr>
-            <w:tcW w:type="dxa" w:w="2592"/>
+            <w:tcW w:type="dxa" w:w="1872"/>
             <w:shd w:fill="FFFFFF"/>
             <w:tcMar>
-              <w:top w:w="60" w:type="dxa"/>
-              <w:bottom w:w="60" w:type="dxa"/>
-              <w:left w:w="100" w:type="dxa"/>
-              <w:right w:w="100" w:type="dxa"/>
+              <w:top w:w="30" w:type="dxa"/>
+              <w:bottom w:w="30" w:type="dxa"/>
+              <w:left w:w="45" w:type="dxa"/>
+              <w:right w:w="45" w:type="dxa"/>
             </w:tcMar>
           </w:tcPr>
           <w:p>
@@ -433,21 +884,21 @@
                 <w:rFonts w:ascii="Arial" w:hAnsi="Arial"/>
                 <w:b/>
                 <w:color w:val="1E2832"/>
-                <w:sz w:val="18"/>
+                <w:sz w:val="15"/>
               </w:rPr>
-              <w:t>Vị trí &amp; Thu nhập</w:t>
+              <w:t>Tư Duy Nghiệp Vụ</w:t>
             </w:r>
           </w:p>
         </w:tc>
         <w:tc>
           <w:tcPr>
-            <w:tcW w:type="dxa" w:w="3456"/>
+            <w:tcW w:type="dxa" w:w="2592"/>
             <w:shd w:fill="FFFFFF"/>
             <w:tcMar>
-              <w:top w:w="60" w:type="dxa"/>
-              <w:bottom w:w="60" w:type="dxa"/>
-              <w:left w:w="100" w:type="dxa"/>
-              <w:right w:w="100" w:type="dxa"/>
+              <w:top w:w="30" w:type="dxa"/>
+              <w:bottom w:w="30" w:type="dxa"/>
+              <w:left w:w="45" w:type="dxa"/>
+              <w:right w:w="45" w:type="dxa"/>
             </w:tcMar>
           </w:tcPr>
           <w:p>
@@ -455,21 +906,21 @@
               <w:rPr>
                 <w:rFonts w:ascii="Arial" w:hAnsi="Arial"/>
                 <w:color w:val="1E2832"/>
-                <w:sz w:val="18"/>
+                <w:sz w:val="15"/>
               </w:rPr>
-              <w:t>Odoo Developer / Lead ($800 - $2,500)</w:t>
+              <w:t>Tư duy kỹ thuật, xử lý phân tán</w:t>
             </w:r>
           </w:p>
         </w:tc>
         <w:tc>
           <w:tcPr>
-            <w:tcW w:type="dxa" w:w="3456"/>
+            <w:tcW w:type="dxa" w:w="2592"/>
             <w:shd w:fill="FFFFFF"/>
             <w:tcMar>
-              <w:top w:w="60" w:type="dxa"/>
-              <w:bottom w:w="60" w:type="dxa"/>
-              <w:left w:w="100" w:type="dxa"/>
-              <w:right w:w="100" w:type="dxa"/>
+              <w:top w:w="30" w:type="dxa"/>
+              <w:bottom w:w="30" w:type="dxa"/>
+              <w:left w:w="45" w:type="dxa"/>
+              <w:right w:w="45" w:type="dxa"/>
             </w:tcMar>
           </w:tcPr>
           <w:p>
@@ -477,1352 +928,40 @@
               <w:rPr>
                 <w:rFonts w:ascii="Arial" w:hAnsi="Arial"/>
                 <w:color w:val="1E2832"/>
-                <w:sz w:val="18"/>
+                <w:sz w:val="15"/>
               </w:rPr>
-              <w:t>SAP Consultant / Architect ($1,500 - $5,000+)</w:t>
+              <w:t>Luồng kinh doanh chuẩn: P2P, O2C, Kế toán kép (Dr/Cr)</w:t>
             </w:r>
           </w:p>
         </w:tc>
-      </w:tr>
-    </w:tbl>
-    <w:p>
-      <w:pPr>
-        <w:spacing w:after="120"/>
-      </w:pPr>
-    </w:p>
-    <w:p>
-      <w:pPr>
-        <w:keepNext/>
-        <w:spacing w:before="320" w:after="120"/>
-      </w:pPr>
-      <w:r>
-        <w:rPr>
-          <w:rFonts w:ascii="Arial" w:hAnsi="Arial"/>
-          <w:b/>
-          <w:color w:val="0E2B52"/>
-          <w:sz w:val="30"/>
-        </w:rPr>
-        <w:t>2. Giai Đoạn 1: Làm Chủ Ruột Gan ERP Với Odoo &amp; Lập Trình Phân Tán</w:t>
-      </w:r>
-    </w:p>
-    <w:p>
-      <w:pPr>
-        <w:spacing w:after="80"/>
-      </w:pPr>
-      <w:r>
-        <w:rPr>
-          <w:rFonts w:ascii="Arial" w:hAnsi="Arial"/>
-          <w:i/>
-          <w:sz w:val="20"/>
-        </w:rPr>
-        <w:t>Thời gian: Năm 3 (Tháng 1 — Tháng 3) | Mục tiêu: Hiểu thấu 100% cách ERP tổ chức dữ liệu &amp; dòng tiền.</w:t>
-      </w:r>
-    </w:p>
-    <w:p>
-      <w:pPr>
-        <w:keepNext/>
-        <w:spacing w:before="240" w:after="80"/>
-      </w:pPr>
-      <w:r>
-        <w:rPr>
-          <w:rFonts w:ascii="Arial" w:hAnsi="Arial"/>
-          <w:b/>
-          <w:color w:val="0D4F3C"/>
-          <w:sz w:val="25"/>
-        </w:rPr>
-        <w:t>A. Nội Dung Cần Học (Kiến Thức &amp; Nghiệp Vụ Chuẩn):</w:t>
-      </w:r>
-    </w:p>
-    <w:p>
-      <w:pPr>
-        <w:pStyle w:val="ListBullet"/>
-        <w:spacing w:before="20" w:after="40" w:line="276" w:lineRule="auto"/>
-      </w:pPr>
-      <w:r>
-        <w:rPr>
-          <w:rFonts w:ascii="Arial" w:hAnsi="Arial"/>
-          <w:b/>
-          <w:color w:val="141E28"/>
-          <w:sz w:val="20"/>
-        </w:rPr>
-        <w:t xml:space="preserve">4 Luồng Nghiệp Vụ Cốt Lõi: </w:t>
-      </w:r>
-      <w:r>
-        <w:rPr>
-          <w:rFonts w:ascii="Arial" w:hAnsi="Arial"/>
-          <w:color w:val="323C46"/>
-          <w:sz w:val="20"/>
-        </w:rPr>
-        <w:t>P2P (Procure-to-Pay: PR → PO → GRN → Vendor Bill → Payment), O2C (Order-to-Cash: Báo giá → SO → Xuất kho → Invoice → Thu tiền), Kế toán kép (Double-entry Debit/Credit), Kho vận (Double-entry Inventory Moves, FIFO/AVCO).</w:t>
-      </w:r>
-    </w:p>
-    <w:p>
-      <w:pPr>
-        <w:pStyle w:val="ListBullet"/>
-        <w:spacing w:before="20" w:after="40" w:line="276" w:lineRule="auto"/>
-      </w:pPr>
-      <w:r>
-        <w:rPr>
-          <w:rFonts w:ascii="Arial" w:hAnsi="Arial"/>
-          <w:b/>
-          <w:color w:val="141E28"/>
-          <w:sz w:val="20"/>
-        </w:rPr>
-        <w:t xml:space="preserve">Kỹ Thuật Odoo ORM: </w:t>
-      </w:r>
-      <w:r>
-        <w:rPr>
-          <w:rFonts w:ascii="Arial" w:hAnsi="Arial"/>
-          <w:color w:val="323C46"/>
-          <w:sz w:val="20"/>
-        </w:rPr>
-        <w:t>Kế thừa Model (_inherit), quan hệ Many2one/One2many, Decorators (@api.depends, @api.constrains), Phân quyền Record Rules (ir.rule).</w:t>
-      </w:r>
-    </w:p>
-    <w:p>
-      <w:pPr>
-        <w:pStyle w:val="ListBullet"/>
-        <w:spacing w:before="20" w:after="40" w:line="276" w:lineRule="auto"/>
-      </w:pPr>
-      <w:r>
-        <w:rPr>
-          <w:rFonts w:ascii="Arial" w:hAnsi="Arial"/>
-          <w:b/>
-          <w:color w:val="141E28"/>
-          <w:sz w:val="20"/>
-        </w:rPr>
-        <w:t xml:space="preserve">Database PostgreSQL: </w:t>
-      </w:r>
-      <w:r>
-        <w:rPr>
-          <w:rFonts w:ascii="Arial" w:hAnsi="Arial"/>
-          <w:color w:val="323C46"/>
-          <w:sz w:val="20"/>
-        </w:rPr>
-        <w:t>Cơ chế Transaction ACID, Row-level Locks, MVCC và cách Odoo tối ưu truy vấn.</w:t>
-      </w:r>
-    </w:p>
-    <w:p>
-      <w:pPr>
-        <w:keepNext/>
-        <w:spacing w:before="240" w:after="80"/>
-      </w:pPr>
-      <w:r>
-        <w:rPr>
-          <w:rFonts w:ascii="Arial" w:hAnsi="Arial"/>
-          <w:b/>
-          <w:color w:val="0D4F3C"/>
-          <w:sz w:val="25"/>
-        </w:rPr>
-        <w:t>B. Nhiệm Vụ Cần Làm (Thực Chiến Checklist):</w:t>
-      </w:r>
-    </w:p>
-    <w:p>
-      <w:pPr>
-        <w:pStyle w:val="ListBullet"/>
-        <w:spacing w:before="20" w:after="40" w:line="276" w:lineRule="auto"/>
-      </w:pPr>
-      <w:r>
-        <w:rPr>
-          <w:rFonts w:ascii="Arial" w:hAnsi="Arial"/>
-          <w:b/>
-          <w:color w:val="141E28"/>
-          <w:sz w:val="20"/>
-        </w:rPr>
-        <w:t xml:space="preserve">Task 1.1: </w:t>
-      </w:r>
-      <w:r>
-        <w:rPr>
-          <w:rFonts w:ascii="Arial" w:hAnsi="Arial"/>
-          <w:color w:val="323C46"/>
-          <w:sz w:val="20"/>
-        </w:rPr>
-        <w:t>Viết docker-compose.yml chạy cụm Odoo 17 Community + PostgreSQL 16 cục bộ.</w:t>
-      </w:r>
-    </w:p>
-    <w:p>
-      <w:pPr>
-        <w:pStyle w:val="ListBullet"/>
-        <w:spacing w:before="20" w:after="40" w:line="276" w:lineRule="auto"/>
-      </w:pPr>
-      <w:r>
-        <w:rPr>
-          <w:rFonts w:ascii="Arial" w:hAnsi="Arial"/>
-          <w:b/>
-          <w:color w:val="141E28"/>
-          <w:sz w:val="20"/>
-        </w:rPr>
-        <w:t xml:space="preserve">Task 1.2: </w:t>
-      </w:r>
-      <w:r>
-        <w:rPr>
-          <w:rFonts w:ascii="Arial" w:hAnsi="Arial"/>
-          <w:color w:val="323C46"/>
-          <w:sz w:val="20"/>
-        </w:rPr>
-        <w:t>Thao tác trọn vẹn 1 chu trình mua hàng P2P và 1 chu trình bán hàng O2C trên giao diện Odoo thật.</w:t>
-      </w:r>
-    </w:p>
-    <w:p>
-      <w:pPr>
-        <w:pStyle w:val="ListBullet"/>
-        <w:spacing w:before="20" w:after="40" w:line="276" w:lineRule="auto"/>
-      </w:pPr>
-      <w:r>
-        <w:rPr>
-          <w:rFonts w:ascii="Arial" w:hAnsi="Arial"/>
-          <w:b/>
-          <w:color w:val="141E28"/>
-          <w:sz w:val="20"/>
-        </w:rPr>
-        <w:t xml:space="preserve">Task 1.3: </w:t>
-      </w:r>
-      <w:r>
-        <w:rPr>
-          <w:rFonts w:ascii="Arial" w:hAnsi="Arial"/>
-          <w:color w:val="323C46"/>
-          <w:sz w:val="20"/>
-        </w:rPr>
-        <w:t>Viết Custom Odoo Module bằng Python: Khi bấm 'Approve PO', gửi request gRPC/REST sang Standalone Go PDP Engine để đánh giá quyền ABAC.</w:t>
-      </w:r>
-    </w:p>
-    <w:p>
-      <w:pPr>
-        <w:keepNext/>
-        <w:spacing w:before="240" w:after="80"/>
-      </w:pPr>
-      <w:r>
-        <w:rPr>
-          <w:rFonts w:ascii="Arial" w:hAnsi="Arial"/>
-          <w:b/>
-          <w:color w:val="0D4F3C"/>
-          <w:sz w:val="25"/>
-        </w:rPr>
-        <w:t>C. Sản Phẩm Đầu Ra &amp; Điểm Nhấn CV:</w:t>
-      </w:r>
-    </w:p>
-    <w:p>
-      <w:pPr>
-        <w:pStyle w:val="ListBullet"/>
-        <w:spacing w:before="20" w:after="40" w:line="276" w:lineRule="auto"/>
-      </w:pPr>
-      <w:r>
-        <w:rPr>
-          <w:rFonts w:ascii="Arial" w:hAnsi="Arial"/>
-          <w:b/>
-          <w:color w:val="141E28"/>
-          <w:sz w:val="20"/>
-        </w:rPr>
-        <w:t xml:space="preserve">Sản phẩm: </w:t>
-      </w:r>
-      <w:r>
-        <w:rPr>
-          <w:rFonts w:ascii="Arial" w:hAnsi="Arial"/>
-          <w:color w:val="323C46"/>
-          <w:sz w:val="20"/>
-        </w:rPr>
-        <w:t>Repository GitHub chứa module Odoo tích hợp Standalone Go PDP hoàn chỉnh.</w:t>
-      </w:r>
-    </w:p>
-    <w:p>
-      <w:pPr>
-        <w:pStyle w:val="ListBullet"/>
-        <w:spacing w:before="20" w:after="40" w:line="276" w:lineRule="auto"/>
-      </w:pPr>
-      <w:r>
-        <w:rPr>
-          <w:rFonts w:ascii="Arial" w:hAnsi="Arial"/>
-          <w:b/>
-          <w:color w:val="141E28"/>
-          <w:sz w:val="20"/>
-        </w:rPr>
-        <w:t xml:space="preserve">Bullet Point CV: </w:t>
-      </w:r>
-      <w:r>
-        <w:rPr>
-          <w:rFonts w:ascii="Arial" w:hAnsi="Arial"/>
-          <w:color w:val="323C46"/>
-          <w:sz w:val="20"/>
-        </w:rPr>
-        <w:t>'Engineered custom Odoo 17 enterprise modules with distributed gRPC authorization hooks, offloading dynamic ABAC decision logic to an in-memory Go Policy Decision Point with sub-millisecond evaluation latency.'</w:t>
-      </w:r>
-    </w:p>
-    <w:p>
-      <w:pPr>
-        <w:keepNext/>
-        <w:spacing w:before="320" w:after="120"/>
-      </w:pPr>
-      <w:r>
-        <w:rPr>
-          <w:rFonts w:ascii="Arial" w:hAnsi="Arial"/>
-          <w:b/>
-          <w:color w:val="0E2B52"/>
-          <w:sz w:val="30"/>
-        </w:rPr>
-        <w:t>3. Giai Đoạn 2: Tiếp Cận Chuẩn Mực Doanh Nghiệp Tỷ USD Với SAP</w:t>
-      </w:r>
-    </w:p>
-    <w:p>
-      <w:pPr>
-        <w:spacing w:after="80"/>
-      </w:pPr>
-      <w:r>
-        <w:rPr>
-          <w:rFonts w:ascii="Arial" w:hAnsi="Arial"/>
-          <w:i/>
-          <w:sz w:val="20"/>
-        </w:rPr>
-        <w:t>Thời gian: Hè Năm 3 (Tháng 4 — Tháng 6) | Mục tiêu: Nắm vững chuẩn mực quy trình SAP S/4HANA, SAP BTP &amp; Kiến trúc Two-Tier ERP.</w:t>
-      </w:r>
-    </w:p>
-    <w:p>
-      <w:pPr>
-        <w:keepNext/>
-        <w:spacing w:before="240" w:after="80"/>
-      </w:pPr>
-      <w:r>
-        <w:rPr>
-          <w:rFonts w:ascii="Arial" w:hAnsi="Arial"/>
-          <w:b/>
-          <w:color w:val="0D4F3C"/>
-          <w:sz w:val="25"/>
-        </w:rPr>
-        <w:t>A. Nội Dung Cần Học:</w:t>
-      </w:r>
-    </w:p>
-    <w:p>
-      <w:pPr>
-        <w:pStyle w:val="ListBullet"/>
-        <w:spacing w:before="20" w:after="40" w:line="276" w:lineRule="auto"/>
-      </w:pPr>
-      <w:r>
-        <w:rPr>
-          <w:rFonts w:ascii="Arial" w:hAnsi="Arial"/>
-          <w:b/>
-          <w:color w:val="141E28"/>
-          <w:sz w:val="20"/>
-        </w:rPr>
-        <w:t xml:space="preserve">Cấu Trúc Doanh Nghiệp SAP: </w:t>
-      </w:r>
-      <w:r>
-        <w:rPr>
-          <w:rFonts w:ascii="Arial" w:hAnsi="Arial"/>
-          <w:color w:val="323C46"/>
-          <w:sz w:val="20"/>
-        </w:rPr>
-        <w:t>Client → Company Code (BUKRS - Pháp nhân) → Plant (WERKS - Nhà máy) → Purchasing/Sales Org → Cost Center (KOSTL).</w:t>
-      </w:r>
-    </w:p>
-    <w:p>
-      <w:pPr>
-        <w:pStyle w:val="ListBullet"/>
-        <w:spacing w:before="20" w:after="40" w:line="276" w:lineRule="auto"/>
-      </w:pPr>
-      <w:r>
-        <w:rPr>
-          <w:rFonts w:ascii="Arial" w:hAnsi="Arial"/>
-          <w:b/>
-          <w:color w:val="141E28"/>
-          <w:sz w:val="20"/>
-        </w:rPr>
-        <w:t xml:space="preserve">Công Nghệ SAP Clean Core: </w:t>
-      </w:r>
-      <w:r>
-        <w:rPr>
-          <w:rFonts w:ascii="Arial" w:hAnsi="Arial"/>
-          <w:color w:val="323C46"/>
-          <w:sz w:val="20"/>
-        </w:rPr>
-        <w:t>Nguyên tắc mở rộng Side-by-Side trên SAP BTP, giao thức chuẩn SAP OData v2/v4 Services (JSON/REST APIs).</w:t>
-      </w:r>
-    </w:p>
-    <w:p>
-      <w:pPr>
-        <w:pStyle w:val="ListBullet"/>
-        <w:spacing w:before="20" w:after="40" w:line="276" w:lineRule="auto"/>
-      </w:pPr>
-      <w:r>
-        <w:rPr>
-          <w:rFonts w:ascii="Arial" w:hAnsi="Arial"/>
-          <w:b/>
-          <w:color w:val="141E28"/>
-          <w:sz w:val="20"/>
-        </w:rPr>
-        <w:t xml:space="preserve">Bảo Mật &amp; Phân Quyền SAP GRC: </w:t>
-      </w:r>
-      <w:r>
-        <w:rPr>
-          <w:rFonts w:ascii="Arial" w:hAnsi="Arial"/>
-          <w:color w:val="323C46"/>
-          <w:sz w:val="20"/>
-        </w:rPr>
-        <w:t>Authorization Objects (M_BEST_EKO, F_BKPF_BUK) và Ma trận Phân tách trách nhiệm (Separation of Duties - SoD).</w:t>
-      </w:r>
-    </w:p>
-    <w:p>
-      <w:pPr>
-        <w:keepNext/>
-        <w:spacing w:before="240" w:after="80"/>
-      </w:pPr>
-      <w:r>
-        <w:rPr>
-          <w:rFonts w:ascii="Arial" w:hAnsi="Arial"/>
-          <w:b/>
-          <w:color w:val="0D4F3C"/>
-          <w:sz w:val="25"/>
-        </w:rPr>
-        <w:t>B. Nhiệm Vụ Cần Làm:</w:t>
-      </w:r>
-    </w:p>
-    <w:p>
-      <w:pPr>
-        <w:pStyle w:val="ListBullet"/>
-        <w:spacing w:before="20" w:after="40" w:line="276" w:lineRule="auto"/>
-      </w:pPr>
-      <w:r>
-        <w:rPr>
-          <w:rFonts w:ascii="Arial" w:hAnsi="Arial"/>
-          <w:b/>
-          <w:color w:val="141E28"/>
-          <w:sz w:val="20"/>
-        </w:rPr>
-        <w:t xml:space="preserve">Task 2.1: </w:t>
-      </w:r>
-      <w:r>
-        <w:rPr>
-          <w:rFonts w:ascii="Arial" w:hAnsi="Arial"/>
-          <w:color w:val="323C46"/>
-          <w:sz w:val="20"/>
-        </w:rPr>
-        <w:t>Học và hoàn thành chứng chỉ miễn phí trên learning.sap.com / openSAP (Discovering SAP S/4HANA, SAP BTP).</w:t>
-      </w:r>
-    </w:p>
-    <w:p>
-      <w:pPr>
-        <w:pStyle w:val="ListBullet"/>
-        <w:spacing w:before="20" w:after="40" w:line="276" w:lineRule="auto"/>
-      </w:pPr>
-      <w:r>
-        <w:rPr>
-          <w:rFonts w:ascii="Arial" w:hAnsi="Arial"/>
-          <w:b/>
-          <w:color w:val="141E28"/>
-          <w:sz w:val="20"/>
-        </w:rPr>
-        <w:t xml:space="preserve">Task 2.2: </w:t>
-      </w:r>
-      <w:r>
-        <w:rPr>
-          <w:rFonts w:ascii="Arial" w:hAnsi="Arial"/>
-          <w:color w:val="323C46"/>
-          <w:sz w:val="20"/>
-        </w:rPr>
-        <w:t>Dùng AI viết Mock SAP S/4HANA OData Server bằng Go (EntitySet /A_PurchaseOrder, /A_JournalEntry).</w:t>
-      </w:r>
-    </w:p>
-    <w:p>
-      <w:pPr>
-        <w:pStyle w:val="ListBullet"/>
-        <w:spacing w:before="20" w:after="40" w:line="276" w:lineRule="auto"/>
-      </w:pPr>
-      <w:r>
-        <w:rPr>
-          <w:rFonts w:ascii="Arial" w:hAnsi="Arial"/>
-          <w:b/>
-          <w:color w:val="141E28"/>
-          <w:sz w:val="20"/>
-        </w:rPr>
-        <w:t xml:space="preserve">Task 2.3 (Two-Tier ERP Bridge): </w:t>
-      </w:r>
-      <w:r>
-        <w:rPr>
-          <w:rFonts w:ascii="Arial" w:hAnsi="Arial"/>
-          <w:color w:val="323C46"/>
-          <w:sz w:val="20"/>
-        </w:rPr>
-        <w:t>Đồng bộ giao dịch PO/Invoice từ Odoo (Chi nhánh) sang Mock SAP S/4HANA (Trụ sở tập đoàn), bảo vệ an toàn bởi Go PDP Engine.</w:t>
-      </w:r>
-    </w:p>
-    <w:p>
-      <w:pPr>
-        <w:keepNext/>
-        <w:spacing w:before="240" w:after="80"/>
-      </w:pPr>
-      <w:r>
-        <w:rPr>
-          <w:rFonts w:ascii="Arial" w:hAnsi="Arial"/>
-          <w:b/>
-          <w:color w:val="0D4F3C"/>
-          <w:sz w:val="25"/>
-        </w:rPr>
-        <w:t>C. Sản Phẩm Đầu Ra &amp; Điểm Nhấn CV:</w:t>
-      </w:r>
-    </w:p>
-    <w:p>
-      <w:pPr>
-        <w:pStyle w:val="ListBullet"/>
-        <w:spacing w:before="20" w:after="40" w:line="276" w:lineRule="auto"/>
-      </w:pPr>
-      <w:r>
-        <w:rPr>
-          <w:rFonts w:ascii="Arial" w:hAnsi="Arial"/>
-          <w:b/>
-          <w:color w:val="141E28"/>
-          <w:sz w:val="20"/>
-        </w:rPr>
-        <w:t xml:space="preserve">Sản phẩm: </w:t>
-      </w:r>
-      <w:r>
-        <w:rPr>
-          <w:rFonts w:ascii="Arial" w:hAnsi="Arial"/>
-          <w:color w:val="323C46"/>
-          <w:sz w:val="20"/>
-        </w:rPr>
-        <w:t>1-2 Chứng chỉ chính thức từ SAP Official + Mô hình Two-Tier ERP tích hợp.</w:t>
-      </w:r>
-    </w:p>
-    <w:p>
-      <w:pPr>
-        <w:pStyle w:val="ListBullet"/>
-        <w:spacing w:before="20" w:after="40" w:line="276" w:lineRule="auto"/>
-      </w:pPr>
-      <w:r>
-        <w:rPr>
-          <w:rFonts w:ascii="Arial" w:hAnsi="Arial"/>
-          <w:b/>
-          <w:color w:val="141E28"/>
-          <w:sz w:val="20"/>
-        </w:rPr>
-        <w:t xml:space="preserve">Bullet Point CV: </w:t>
-      </w:r>
-      <w:r>
-        <w:rPr>
-          <w:rFonts w:ascii="Arial" w:hAnsi="Arial"/>
-          <w:color w:val="323C46"/>
-          <w:sz w:val="20"/>
-        </w:rPr>
-        <w:t>'Architected an event-driven Two-Tier ERP integration bridge syncing Branch transactions (Odoo) to Corporate HQ (SAP S/4HANA OData v4 APIs) guarded by a high-throughput Go ABAC Policy Engine.'</w:t>
-      </w:r>
-    </w:p>
-    <w:p>
-      <w:pPr>
-        <w:keepNext/>
-        <w:spacing w:before="320" w:after="120"/>
-      </w:pPr>
-      <w:r>
-        <w:rPr>
-          <w:rFonts w:ascii="Arial" w:hAnsi="Arial"/>
-          <w:b/>
-          <w:color w:val="0E2B52"/>
-          <w:sz w:val="30"/>
-        </w:rPr>
-        <w:t>4. Giai Đoạn 3: Hoàn Thiện Đồ Án Tốt Nghiệp Xuất Sắc &amp; Săn Thực Tập</w:t>
-      </w:r>
-    </w:p>
-    <w:p>
-      <w:pPr>
-        <w:spacing w:after="80"/>
-      </w:pPr>
-      <w:r>
-        <w:rPr>
-          <w:rFonts w:ascii="Arial" w:hAnsi="Arial"/>
-          <w:i/>
-          <w:sz w:val="20"/>
-        </w:rPr>
-        <w:t>Thời gian: Năm 4 (Tháng 7 — Tháng 12) | Mục tiêu: Đạt điểm Đồ án 9.5 - 10 &amp; Nhận Offer Thực tập sinh/Fresher có lương.</w:t>
-      </w:r>
-    </w:p>
-    <w:p>
-      <w:pPr>
-        <w:keepNext/>
-        <w:spacing w:before="240" w:after="80"/>
-      </w:pPr>
-      <w:r>
-        <w:rPr>
-          <w:rFonts w:ascii="Arial" w:hAnsi="Arial"/>
-          <w:b/>
-          <w:color w:val="0D4F3C"/>
-          <w:sz w:val="25"/>
-        </w:rPr>
-        <w:t>A. Kịch Bản Live Demo 5 Phút Trước Hội Đồng:</w:t>
-      </w:r>
-    </w:p>
-    <w:p>
-      <w:pPr>
-        <w:pStyle w:val="ListBullet"/>
-        <w:spacing w:before="20" w:after="40" w:line="276" w:lineRule="auto"/>
-      </w:pPr>
-      <w:r>
-        <w:rPr>
-          <w:rFonts w:ascii="Arial" w:hAnsi="Arial"/>
-          <w:b/>
-          <w:color w:val="141E28"/>
-          <w:sz w:val="20"/>
-        </w:rPr>
-        <w:t xml:space="preserve">Phút 1: </w:t>
-      </w:r>
-      <w:r>
-        <w:rPr>
-          <w:rFonts w:ascii="Arial" w:hAnsi="Arial"/>
-          <w:color w:val="323C46"/>
-          <w:sz w:val="20"/>
-        </w:rPr>
-        <w:t>Trình bày sơ đồ kiến trúc tổng thể (Envoy PEP ↔ PDP Go Server :50051 ↔ PostgreSQL).</w:t>
-      </w:r>
-    </w:p>
-    <w:p>
-      <w:pPr>
-        <w:pStyle w:val="ListBullet"/>
-        <w:spacing w:before="20" w:after="40" w:line="276" w:lineRule="auto"/>
-      </w:pPr>
-      <w:r>
-        <w:rPr>
-          <w:rFonts w:ascii="Arial" w:hAnsi="Arial"/>
-          <w:b/>
-          <w:color w:val="141E28"/>
-          <w:sz w:val="20"/>
-        </w:rPr>
-        <w:t xml:space="preserve">Phút 2: </w:t>
-      </w:r>
-      <w:r>
-        <w:rPr>
-          <w:rFonts w:ascii="Arial" w:hAnsi="Arial"/>
-          <w:color w:val="323C46"/>
-          <w:sz w:val="20"/>
-        </w:rPr>
-        <w:t>Demo trực tiếp trên giao diện Odoo: Duyệt PO đúng hạn mức (ALLOW) vs Người tạo tự duyệt (DENY do SoD).</w:t>
-      </w:r>
-    </w:p>
-    <w:p>
-      <w:pPr>
-        <w:pStyle w:val="ListBullet"/>
-        <w:spacing w:before="20" w:after="40" w:line="276" w:lineRule="auto"/>
-      </w:pPr>
-      <w:r>
-        <w:rPr>
-          <w:rFonts w:ascii="Arial" w:hAnsi="Arial"/>
-          <w:b/>
-          <w:color w:val="141E28"/>
-          <w:sz w:val="20"/>
-        </w:rPr>
-        <w:t xml:space="preserve">Phút 3: </w:t>
-      </w:r>
-      <w:r>
-        <w:rPr>
-          <w:rFonts w:ascii="Arial" w:hAnsi="Arial"/>
-          <w:color w:val="323C46"/>
-          <w:sz w:val="20"/>
-        </w:rPr>
-        <w:t>Demo tính năng ExplainDecision gRPC trả về chính xác Policy ID phục vụ kiểm toán.</w:t>
-      </w:r>
-    </w:p>
-    <w:p>
-      <w:pPr>
-        <w:pStyle w:val="ListBullet"/>
-        <w:spacing w:before="20" w:after="40" w:line="276" w:lineRule="auto"/>
-      </w:pPr>
-      <w:r>
-        <w:rPr>
-          <w:rFonts w:ascii="Arial" w:hAnsi="Arial"/>
-          <w:b/>
-          <w:color w:val="141E28"/>
-          <w:sz w:val="20"/>
-        </w:rPr>
-        <w:t xml:space="preserve">Phút 4: </w:t>
-      </w:r>
-      <w:r>
-        <w:rPr>
-          <w:rFonts w:ascii="Arial" w:hAnsi="Arial"/>
-          <w:color w:val="323C46"/>
-          <w:sz w:val="20"/>
-        </w:rPr>
-        <w:t>Demo Hot-Reload &lt; 300ms qua Redis Pub/Sub và cơ chế Spill-to-Disk khi Database PostgreSQL bị ngắt kết nối.</w:t>
-      </w:r>
-    </w:p>
-    <w:p>
-      <w:pPr>
-        <w:pStyle w:val="ListBullet"/>
-        <w:spacing w:before="20" w:after="40" w:line="276" w:lineRule="auto"/>
-      </w:pPr>
-      <w:r>
-        <w:rPr>
-          <w:rFonts w:ascii="Arial" w:hAnsi="Arial"/>
-          <w:b/>
-          <w:color w:val="141E28"/>
-          <w:sz w:val="20"/>
-        </w:rPr>
-        <w:t xml:space="preserve">Phút 5: </w:t>
-      </w:r>
-      <w:r>
-        <w:rPr>
-          <w:rFonts w:ascii="Arial" w:hAnsi="Arial"/>
-          <w:color w:val="323C46"/>
-          <w:sz w:val="20"/>
-        </w:rPr>
-        <w:t>Chạy Benchmark trực tiếp: Chứng minh thông lượng &gt; 1.000.000 RPS và độ trễ 0.9 µs trong RAM.</w:t>
-      </w:r>
-    </w:p>
-    <w:p>
-      <w:pPr>
-        <w:keepNext/>
-        <w:spacing w:before="240" w:after="80"/>
-      </w:pPr>
-      <w:r>
-        <w:rPr>
-          <w:rFonts w:ascii="Arial" w:hAnsi="Arial"/>
-          <w:b/>
-          <w:color w:val="0D4F3C"/>
-          <w:sz w:val="25"/>
-        </w:rPr>
-        <w:t>B. Danh Sách Doanh Nghiệp Mục Tiêu Nộp CV:</w:t>
-      </w:r>
-    </w:p>
-    <w:p>
-      <w:pPr>
-        <w:pStyle w:val="ListBullet"/>
-        <w:spacing w:before="20" w:after="40" w:line="276" w:lineRule="auto"/>
-      </w:pPr>
-      <w:r>
-        <w:rPr>
-          <w:rFonts w:ascii="Arial" w:hAnsi="Arial"/>
-          <w:b/>
-          <w:color w:val="141E28"/>
-          <w:sz w:val="20"/>
-        </w:rPr>
-        <w:t xml:space="preserve">Doanh nghiệp Triển khai ERP lớn: </w:t>
-      </w:r>
-      <w:r>
-        <w:rPr>
-          <w:rFonts w:ascii="Arial" w:hAnsi="Arial"/>
-          <w:color w:val="323C46"/>
-          <w:sz w:val="20"/>
-        </w:rPr>
-        <w:t>FPT Software (FJP/FHN/FHM), Viettel Solutions, CMC Global, SmartOSC, BAP, A1 Consulting.</w:t>
-      </w:r>
-    </w:p>
-    <w:p>
-      <w:pPr>
-        <w:pStyle w:val="ListBullet"/>
-        <w:spacing w:before="20" w:after="40" w:line="276" w:lineRule="auto"/>
-      </w:pPr>
-      <w:r>
-        <w:rPr>
-          <w:rFonts w:ascii="Arial" w:hAnsi="Arial"/>
-          <w:b/>
-          <w:color w:val="141E28"/>
-          <w:sz w:val="20"/>
-        </w:rPr>
-        <w:t xml:space="preserve">Tập đoàn Tư vấn Quốc tế (Big 4): </w:t>
-      </w:r>
-      <w:r>
-        <w:rPr>
-          <w:rFonts w:ascii="Arial" w:hAnsi="Arial"/>
-          <w:color w:val="323C46"/>
-          <w:sz w:val="20"/>
-        </w:rPr>
-        <w:t>Deloitte, PwC, EY, KPMG (Technology Consulting / Technology Risk).</w:t>
-      </w:r>
-    </w:p>
-    <w:p>
-      <w:pPr>
-        <w:keepNext/>
-        <w:spacing w:before="320" w:after="120"/>
-      </w:pPr>
-      <w:r>
-        <w:rPr>
-          <w:rFonts w:ascii="Arial" w:hAnsi="Arial"/>
-          <w:b/>
-          <w:color w:val="0E2B52"/>
-          <w:sz w:val="30"/>
-        </w:rPr>
-        <w:t>5. Giai Đoạn 4: Nâng Tầm Thành Enterprise Solutions Architect</w:t>
-      </w:r>
-    </w:p>
-    <w:p>
-      <w:pPr>
-        <w:keepNext/>
-        <w:spacing w:before="240" w:after="80"/>
-      </w:pPr>
-      <w:r>
-        <w:rPr>
-          <w:rFonts w:ascii="Arial" w:hAnsi="Arial"/>
-          <w:b/>
-          <w:color w:val="0D4F3C"/>
-          <w:sz w:val="25"/>
-        </w:rPr>
-        <w:t>Lộ Trình Thăng Tiến 3 Năm:</w:t>
-      </w:r>
-    </w:p>
-    <w:p>
-      <w:pPr>
-        <w:pStyle w:val="ListBullet"/>
-        <w:spacing w:before="20" w:after="40" w:line="276" w:lineRule="auto"/>
-      </w:pPr>
-      <w:r>
-        <w:rPr>
-          <w:rFonts w:ascii="Arial" w:hAnsi="Arial"/>
-          <w:b/>
-          <w:color w:val="141E28"/>
-          <w:sz w:val="20"/>
-        </w:rPr>
-        <w:t xml:space="preserve">Năm 1: Technical Consultant (Thu nhập $800 - $1,500/tháng) </w:t>
-      </w:r>
-      <w:r>
-        <w:rPr>
-          <w:rFonts w:ascii="Arial" w:hAnsi="Arial"/>
-          <w:color w:val="323C46"/>
-          <w:sz w:val="20"/>
-        </w:rPr>
-        <w:t>Tham gia dự án triển khai SAP/Odoo thực tế, dùng AI tăng năng suất viết module và tích hợp API gấp 3-5 lần.</w:t>
-      </w:r>
-    </w:p>
-    <w:p>
-      <w:pPr>
-        <w:pStyle w:val="ListBullet"/>
-        <w:spacing w:before="20" w:after="40" w:line="276" w:lineRule="auto"/>
-      </w:pPr>
-      <w:r>
-        <w:rPr>
-          <w:rFonts w:ascii="Arial" w:hAnsi="Arial"/>
-          <w:b/>
-          <w:color w:val="141E28"/>
-          <w:sz w:val="20"/>
-        </w:rPr>
-        <w:t xml:space="preserve">Năm 2-3: Senior Integration Lead (Thu nhập $1,800 - $3,000/tháng) </w:t>
-      </w:r>
-      <w:r>
-        <w:rPr>
-          <w:rFonts w:ascii="Arial" w:hAnsi="Arial"/>
-          <w:color w:val="323C46"/>
-          <w:sz w:val="20"/>
-        </w:rPr>
-        <w:t>Thiết kế kiến trúc tích hợp hệ thống lớn, tối ưu hóa Database &amp; Bảo mật, lấy chứng chỉ SAP Certified Development &amp; AWS Solutions Architect.</w:t>
-      </w:r>
-    </w:p>
-    <w:p>
-      <w:pPr>
-        <w:pStyle w:val="ListBullet"/>
-        <w:spacing w:before="20" w:after="40" w:line="276" w:lineRule="auto"/>
-      </w:pPr>
-      <w:r>
-        <w:rPr>
-          <w:rFonts w:ascii="Arial" w:hAnsi="Arial"/>
-          <w:b/>
-          <w:color w:val="141E28"/>
-          <w:sz w:val="20"/>
-        </w:rPr>
-        <w:t xml:space="preserve">Năm 3+: Principal Solutions Architect (Thu nhập $3,500 - $6,000+/tháng) </w:t>
-      </w:r>
-      <w:r>
-        <w:rPr>
-          <w:rFonts w:ascii="Arial" w:hAnsi="Arial"/>
-          <w:color w:val="323C46"/>
-          <w:sz w:val="20"/>
-        </w:rPr>
-        <w:t>Định hình kiến trúc chuyển đổi số tổng thể cho tập đoàn, quản trị rủi ro Zero Trust.</w:t>
-      </w:r>
-    </w:p>
-    <w:p>
-      <w:pPr>
-        <w:keepNext/>
-        <w:spacing w:before="320" w:after="120"/>
-      </w:pPr>
-      <w:r>
-        <w:rPr>
-          <w:rFonts w:ascii="Arial" w:hAnsi="Arial"/>
-          <w:b/>
-          <w:color w:val="0E2B52"/>
-          <w:sz w:val="30"/>
-        </w:rPr>
-        <w:t>6. Bảng Đo Lường Hiệu Năng Thực Nghiệm Standalone PDP Engine</w:t>
-      </w:r>
-    </w:p>
-    <w:tbl>
-      <w:tblPr>
-        <w:tblW w:type="auto" w:w="0"/>
-        <w:jc w:val="center"/>
-        <w:tblLayout w:type="fixed"/>
-        <w:tblLook w:firstColumn="1" w:firstRow="1" w:lastColumn="0" w:lastRow="0" w:noHBand="0" w:noVBand="1" w:val="04A0"/>
-      </w:tblPr>
-      <w:tblGrid>
-        <w:gridCol w:w="1987"/>
-        <w:gridCol w:w="1987"/>
-        <w:gridCol w:w="1987"/>
-        <w:gridCol w:w="1987"/>
-        <w:gridCol w:w="1987"/>
-      </w:tblGrid>
-      <w:tr>
         <w:tc>
           <w:tcPr>
-            <w:tcW w:type="dxa" w:w="3168"/>
-            <w:shd w:fill="0D4F3C"/>
+            <w:tcW w:type="dxa" w:w="2304"/>
+            <w:shd w:fill="FFFFFF"/>
             <w:tcMar>
-              <w:top w:w="80" w:type="dxa"/>
-              <w:bottom w:w="80" w:type="dxa"/>
-              <w:left w:w="80" w:type="dxa"/>
-              <w:right w:w="80" w:type="dxa"/>
+              <w:top w:w="30" w:type="dxa"/>
+              <w:bottom w:w="30" w:type="dxa"/>
+              <w:left w:w="45" w:type="dxa"/>
+              <w:right w:w="45" w:type="dxa"/>
             </w:tcMar>
           </w:tcPr>
           <w:p>
             <w:r>
               <w:rPr>
                 <w:rFonts w:ascii="Arial" w:hAnsi="Arial"/>
-                <w:b/>
-                <w:color w:val="FFFFFF"/>
-                <w:sz w:val="18"/>
+                <w:color w:val="1E2832"/>
+                <w:sz w:val="15"/>
               </w:rPr>
-              <w:t>Kịch Bản Kiểm Thử</w:t>
-            </w:r>
-          </w:p>
-        </w:tc>
-        <w:tc>
-          <w:tcPr>
-            <w:tcW w:type="dxa" w:w="1584"/>
-            <w:shd w:fill="0D4F3C"/>
-            <w:tcMar>
-              <w:top w:w="80" w:type="dxa"/>
-              <w:bottom w:w="80" w:type="dxa"/>
-              <w:left w:w="80" w:type="dxa"/>
-              <w:right w:w="80" w:type="dxa"/>
-            </w:tcMar>
-          </w:tcPr>
-          <w:p>
-            <w:r>
-              <w:rPr>
-                <w:rFonts w:ascii="Arial" w:hAnsi="Arial"/>
-                <w:b/>
-                <w:color w:val="FFFFFF"/>
-                <w:sz w:val="18"/>
-              </w:rPr>
-              <w:t>Độ Trễ / Op</w:t>
-            </w:r>
-          </w:p>
-        </w:tc>
-        <w:tc>
-          <w:tcPr>
-            <w:tcW w:type="dxa" w:w="1440"/>
-            <w:shd w:fill="0D4F3C"/>
-            <w:tcMar>
-              <w:top w:w="80" w:type="dxa"/>
-              <w:bottom w:w="80" w:type="dxa"/>
-              <w:left w:w="80" w:type="dxa"/>
-              <w:right w:w="80" w:type="dxa"/>
-            </w:tcMar>
-          </w:tcPr>
-          <w:p>
-            <w:r>
-              <w:rPr>
-                <w:rFonts w:ascii="Arial" w:hAnsi="Arial"/>
-                <w:b/>
-                <w:color w:val="FFFFFF"/>
-                <w:sz w:val="18"/>
-              </w:rPr>
-              <w:t>RAM B/op</w:t>
-            </w:r>
-          </w:p>
-        </w:tc>
-        <w:tc>
-          <w:tcPr>
-            <w:tcW w:type="dxa" w:w="1440"/>
-            <w:shd w:fill="0D4F3C"/>
-            <w:tcMar>
-              <w:top w:w="80" w:type="dxa"/>
-              <w:bottom w:w="80" w:type="dxa"/>
-              <w:left w:w="80" w:type="dxa"/>
-              <w:right w:w="80" w:type="dxa"/>
-            </w:tcMar>
-          </w:tcPr>
-          <w:p>
-            <w:r>
-              <w:rPr>
-                <w:rFonts w:ascii="Arial" w:hAnsi="Arial"/>
-                <w:b/>
-                <w:color w:val="FFFFFF"/>
-                <w:sz w:val="18"/>
-              </w:rPr>
-              <w:t>Alloc/op</w:t>
-            </w:r>
-          </w:p>
-        </w:tc>
-        <w:tc>
-          <w:tcPr>
-            <w:tcW w:type="dxa" w:w="1872"/>
-            <w:shd w:fill="0D4F3C"/>
-            <w:tcMar>
-              <w:top w:w="80" w:type="dxa"/>
-              <w:bottom w:w="80" w:type="dxa"/>
-              <w:left w:w="80" w:type="dxa"/>
-              <w:right w:w="80" w:type="dxa"/>
-            </w:tcMar>
-          </w:tcPr>
-          <w:p>
-            <w:r>
-              <w:rPr>
-                <w:rFonts w:ascii="Arial" w:hAnsi="Arial"/>
-                <w:b/>
-                <w:color w:val="FFFFFF"/>
-                <w:sz w:val="18"/>
-              </w:rPr>
-              <w:t>Throughput Ước Tính</w:t>
-            </w:r>
-          </w:p>
-        </w:tc>
-      </w:tr>
-      <w:tr>
-        <w:tc>
-          <w:tcPr>
-            <w:tcW w:type="dxa" w:w="3168"/>
-            <w:shd w:fill="F0FFF4"/>
-            <w:tcMar>
-              <w:top w:w="60" w:type="dxa"/>
-              <w:bottom w:w="60" w:type="dxa"/>
-              <w:left w:w="80" w:type="dxa"/>
-              <w:right w:w="80" w:type="dxa"/>
-            </w:tcMar>
-          </w:tcPr>
-          <w:p>
-            <w:r>
-              <w:rPr>
-                <w:rFonts w:ascii="Arial" w:hAnsi="Arial"/>
-                <w:b/>
-                <w:color w:val="142319"/>
-                <w:sz w:val="17"/>
-              </w:rPr>
-              <w:t>PO Approval ABAC (Đơn luồng)</w:t>
-            </w:r>
-          </w:p>
-        </w:tc>
-        <w:tc>
-          <w:tcPr>
-            <w:tcW w:type="dxa" w:w="1584"/>
-            <w:shd w:fill="F0FFF4"/>
-            <w:tcMar>
-              <w:top w:w="60" w:type="dxa"/>
-              <w:bottom w:w="60" w:type="dxa"/>
-              <w:left w:w="80" w:type="dxa"/>
-              <w:right w:w="80" w:type="dxa"/>
-            </w:tcMar>
-          </w:tcPr>
-          <w:p>
-            <w:r>
-              <w:rPr>
-                <w:rFonts w:ascii="Arial" w:hAnsi="Arial"/>
-                <w:b/>
-                <w:color w:val="142319"/>
-                <w:sz w:val="17"/>
-              </w:rPr>
-              <w:t>5.83 µs/op</w:t>
-            </w:r>
-          </w:p>
-        </w:tc>
-        <w:tc>
-          <w:tcPr>
-            <w:tcW w:type="dxa" w:w="1440"/>
-            <w:shd w:fill="F0FFF4"/>
-            <w:tcMar>
-              <w:top w:w="60" w:type="dxa"/>
-              <w:bottom w:w="60" w:type="dxa"/>
-              <w:left w:w="80" w:type="dxa"/>
-              <w:right w:w="80" w:type="dxa"/>
-            </w:tcMar>
-          </w:tcPr>
-          <w:p>
-            <w:r>
-              <w:rPr>
-                <w:rFonts w:ascii="Arial" w:hAnsi="Arial"/>
-                <w:color w:val="142319"/>
-                <w:sz w:val="17"/>
-              </w:rPr>
-              <w:t>1,454 B</w:t>
-            </w:r>
-          </w:p>
-        </w:tc>
-        <w:tc>
-          <w:tcPr>
-            <w:tcW w:type="dxa" w:w="1440"/>
-            <w:shd w:fill="F0FFF4"/>
-            <w:tcMar>
-              <w:top w:w="60" w:type="dxa"/>
-              <w:bottom w:w="60" w:type="dxa"/>
-              <w:left w:w="80" w:type="dxa"/>
-              <w:right w:w="80" w:type="dxa"/>
-            </w:tcMar>
-          </w:tcPr>
-          <w:p>
-            <w:r>
-              <w:rPr>
-                <w:rFonts w:ascii="Arial" w:hAnsi="Arial"/>
-                <w:color w:val="142319"/>
-                <w:sz w:val="17"/>
-              </w:rPr>
-              <w:t>33 allocs</w:t>
-            </w:r>
-          </w:p>
-        </w:tc>
-        <w:tc>
-          <w:tcPr>
-            <w:tcW w:type="dxa" w:w="1872"/>
-            <w:shd w:fill="F0FFF4"/>
-            <w:tcMar>
-              <w:top w:w="60" w:type="dxa"/>
-              <w:bottom w:w="60" w:type="dxa"/>
-              <w:left w:w="80" w:type="dxa"/>
-              <w:right w:w="80" w:type="dxa"/>
-            </w:tcMar>
-          </w:tcPr>
-          <w:p>
-            <w:r>
-              <w:rPr>
-                <w:rFonts w:ascii="Arial" w:hAnsi="Arial"/>
-                <w:b/>
-                <w:color w:val="142319"/>
-                <w:sz w:val="17"/>
-              </w:rPr>
-              <w:t>~171,000 req/s/core</w:t>
-            </w:r>
-          </w:p>
-        </w:tc>
-      </w:tr>
-      <w:tr>
-        <w:tc>
-          <w:tcPr>
-            <w:tcW w:type="dxa" w:w="3168"/>
-            <w:shd w:fill="FFFFFF"/>
-            <w:tcMar>
-              <w:top w:w="60" w:type="dxa"/>
-              <w:bottom w:w="60" w:type="dxa"/>
-              <w:left w:w="80" w:type="dxa"/>
-              <w:right w:w="80" w:type="dxa"/>
-            </w:tcMar>
-          </w:tcPr>
-          <w:p>
-            <w:r>
-              <w:rPr>
-                <w:rFonts w:ascii="Arial" w:hAnsi="Arial"/>
-                <w:b/>
-                <w:color w:val="142319"/>
-                <w:sz w:val="17"/>
-              </w:rPr>
-              <w:t>Đa luồng đồng thời (20 Cores)</w:t>
-            </w:r>
-          </w:p>
-        </w:tc>
-        <w:tc>
-          <w:tcPr>
-            <w:tcW w:type="dxa" w:w="1584"/>
-            <w:shd w:fill="FFFFFF"/>
-            <w:tcMar>
-              <w:top w:w="60" w:type="dxa"/>
-              <w:bottom w:w="60" w:type="dxa"/>
-              <w:left w:w="80" w:type="dxa"/>
-              <w:right w:w="80" w:type="dxa"/>
-            </w:tcMar>
-          </w:tcPr>
-          <w:p>
-            <w:r>
-              <w:rPr>
-                <w:rFonts w:ascii="Arial" w:hAnsi="Arial"/>
-                <w:b/>
-                <w:color w:val="142319"/>
-                <w:sz w:val="17"/>
-              </w:rPr>
-              <w:t>946.5 ns/op</w:t>
-            </w:r>
-          </w:p>
-        </w:tc>
-        <w:tc>
-          <w:tcPr>
-            <w:tcW w:type="dxa" w:w="1440"/>
-            <w:shd w:fill="FFFFFF"/>
-            <w:tcMar>
-              <w:top w:w="60" w:type="dxa"/>
-              <w:bottom w:w="60" w:type="dxa"/>
-              <w:left w:w="80" w:type="dxa"/>
-              <w:right w:w="80" w:type="dxa"/>
-            </w:tcMar>
-          </w:tcPr>
-          <w:p>
-            <w:r>
-              <w:rPr>
-                <w:rFonts w:ascii="Arial" w:hAnsi="Arial"/>
-                <w:color w:val="142319"/>
-                <w:sz w:val="17"/>
-              </w:rPr>
-              <w:t>748 B</w:t>
-            </w:r>
-          </w:p>
-        </w:tc>
-        <w:tc>
-          <w:tcPr>
-            <w:tcW w:type="dxa" w:w="1440"/>
-            <w:shd w:fill="FFFFFF"/>
-            <w:tcMar>
-              <w:top w:w="60" w:type="dxa"/>
-              <w:bottom w:w="60" w:type="dxa"/>
-              <w:left w:w="80" w:type="dxa"/>
-              <w:right w:w="80" w:type="dxa"/>
-            </w:tcMar>
-          </w:tcPr>
-          <w:p>
-            <w:r>
-              <w:rPr>
-                <w:rFonts w:ascii="Arial" w:hAnsi="Arial"/>
-                <w:color w:val="142319"/>
-                <w:sz w:val="17"/>
-              </w:rPr>
-              <w:t>11 allocs</w:t>
-            </w:r>
-          </w:p>
-        </w:tc>
-        <w:tc>
-          <w:tcPr>
-            <w:tcW w:type="dxa" w:w="1872"/>
-            <w:shd w:fill="FFFFFF"/>
-            <w:tcMar>
-              <w:top w:w="60" w:type="dxa"/>
-              <w:bottom w:w="60" w:type="dxa"/>
-              <w:left w:w="80" w:type="dxa"/>
-              <w:right w:w="80" w:type="dxa"/>
-            </w:tcMar>
-          </w:tcPr>
-          <w:p>
-            <w:r>
-              <w:rPr>
-                <w:rFonts w:ascii="Arial" w:hAnsi="Arial"/>
-                <w:b/>
-                <w:color w:val="142319"/>
-                <w:sz w:val="17"/>
-              </w:rPr>
-              <w:t>&gt; 1,050,000 req/s</w:t>
-            </w:r>
-          </w:p>
-        </w:tc>
-      </w:tr>
-      <w:tr>
-        <w:tc>
-          <w:tcPr>
-            <w:tcW w:type="dxa" w:w="3168"/>
-            <w:shd w:fill="F0FFF4"/>
-            <w:tcMar>
-              <w:top w:w="60" w:type="dxa"/>
-              <w:bottom w:w="60" w:type="dxa"/>
-              <w:left w:w="80" w:type="dxa"/>
-              <w:right w:w="80" w:type="dxa"/>
-            </w:tcMar>
-          </w:tcPr>
-          <w:p>
-            <w:r>
-              <w:rPr>
-                <w:rFonts w:ascii="Arial" w:hAnsi="Arial"/>
-                <w:b/>
-                <w:color w:val="142319"/>
-                <w:sz w:val="17"/>
-              </w:rPr>
-              <w:t>Tra cứu Chỉ mục Trie thuần túy</w:t>
-            </w:r>
-          </w:p>
-        </w:tc>
-        <w:tc>
-          <w:tcPr>
-            <w:tcW w:type="dxa" w:w="1584"/>
-            <w:shd w:fill="F0FFF4"/>
-            <w:tcMar>
-              <w:top w:w="60" w:type="dxa"/>
-              <w:bottom w:w="60" w:type="dxa"/>
-              <w:left w:w="80" w:type="dxa"/>
-              <w:right w:w="80" w:type="dxa"/>
-            </w:tcMar>
-          </w:tcPr>
-          <w:p>
-            <w:r>
-              <w:rPr>
-                <w:rFonts w:ascii="Arial" w:hAnsi="Arial"/>
-                <w:b/>
-                <w:color w:val="142319"/>
-                <w:sz w:val="17"/>
-              </w:rPr>
-              <w:t>449.0 ns/op</w:t>
-            </w:r>
-          </w:p>
-        </w:tc>
-        <w:tc>
-          <w:tcPr>
-            <w:tcW w:type="dxa" w:w="1440"/>
-            <w:shd w:fill="F0FFF4"/>
-            <w:tcMar>
-              <w:top w:w="60" w:type="dxa"/>
-              <w:bottom w:w="60" w:type="dxa"/>
-              <w:left w:w="80" w:type="dxa"/>
-              <w:right w:w="80" w:type="dxa"/>
-            </w:tcMar>
-          </w:tcPr>
-          <w:p>
-            <w:r>
-              <w:rPr>
-                <w:rFonts w:ascii="Arial" w:hAnsi="Arial"/>
-                <w:color w:val="142319"/>
-                <w:sz w:val="17"/>
-              </w:rPr>
-              <w:t>325 B</w:t>
-            </w:r>
-          </w:p>
-        </w:tc>
-        <w:tc>
-          <w:tcPr>
-            <w:tcW w:type="dxa" w:w="1440"/>
-            <w:shd w:fill="F0FFF4"/>
-            <w:tcMar>
-              <w:top w:w="60" w:type="dxa"/>
-              <w:bottom w:w="60" w:type="dxa"/>
-              <w:left w:w="80" w:type="dxa"/>
-              <w:right w:w="80" w:type="dxa"/>
-            </w:tcMar>
-          </w:tcPr>
-          <w:p>
-            <w:r>
-              <w:rPr>
-                <w:rFonts w:ascii="Arial" w:hAnsi="Arial"/>
-                <w:color w:val="142319"/>
-                <w:sz w:val="17"/>
-              </w:rPr>
-              <w:t>10 allocs</w:t>
-            </w:r>
-          </w:p>
-        </w:tc>
-        <w:tc>
-          <w:tcPr>
-            <w:tcW w:type="dxa" w:w="1872"/>
-            <w:shd w:fill="F0FFF4"/>
-            <w:tcMar>
-              <w:top w:w="60" w:type="dxa"/>
-              <w:bottom w:w="60" w:type="dxa"/>
-              <w:left w:w="80" w:type="dxa"/>
-              <w:right w:w="80" w:type="dxa"/>
-            </w:tcMar>
-          </w:tcPr>
-          <w:p>
-            <w:r>
-              <w:rPr>
-                <w:rFonts w:ascii="Arial" w:hAnsi="Arial"/>
-                <w:b/>
-                <w:color w:val="142319"/>
-                <w:sz w:val="17"/>
-              </w:rPr>
-              <w:t>&gt; 2,200,000 req/s</w:t>
+              <w:t>Nghĩ ERP chỉ là CRUD đơn giản mà quên tính toàn vẹn tài chính.</w:t>
             </w:r>
           </w:p>
         </w:tc>
       </w:tr>
     </w:tbl>
-    <w:p>
-      <w:pPr>
-        <w:spacing w:after="240"/>
-      </w:pPr>
-    </w:p>
     <w:sectPr>
       <w:footerReference w:type="default" r:id="rId9"/>
       <w:pgSz w:w="12240" w:h="15840"/>
-      <w:pgMar w:top="1152" w:right="1152" w:bottom="1152" w:left="1152" w:header="720" w:footer="720" w:gutter="0"/>
+      <w:pgMar w:top="1008" w:right="1080" w:bottom="1008" w:left="1080" w:header="720" w:footer="720" w:gutter="0"/>
       <w:cols w:space="720"/>
       <w:docGrid w:linePitch="360"/>
     </w:sectPr>
@@ -1843,7 +982,7 @@
         <w:color w:val="8C96A0"/>
         <w:sz w:val="16"/>
       </w:rPr>
-      <w:t>Bản Quyền Lộ Trình SE &amp; ERP (SAP / Odoo) — Standalone PDP Engine Project</w:t>
+      <w:t>Lộ Trình Chiến Lược: Kỹ Sư SE Bảo Mật PTIT → Chuyên Gia Giải Pháp ERP Quốc Tế</w:t>
     </w:r>
   </w:p>
 </w:ftr>

</xml_diff>